<commit_message>
Better formatted doc added
</commit_message>
<xml_diff>
--- a/Initial software product_solution Doc.docx
+++ b/Initial software product_solution Doc.docx
@@ -119,7 +119,7 @@
             </w:pPr>
             <w:r>
               <w:rPr>
-                <w:rFonts w:ascii="Consolas" w:cs="Consolas" w:eastAsia="Consolas" w:hAnsi="Consolas"/>
+                <w:rFonts w:ascii="Times New Roman" w:cs="Times New Roman" w:eastAsia="Times New Roman" w:hAnsi="Times New Roman"/>
                 <w:color w:val="a8a19f"/>
                 <w:sz w:val="24"/>
                 <w:szCs w:val="24"/>
@@ -130,7 +130,7 @@
             </w:r>
             <w:r>
               <w:rPr>
-                <w:rFonts w:ascii="Consolas" w:cs="Consolas" w:eastAsia="Consolas" w:hAnsi="Consolas"/>
+                <w:rFonts w:ascii="Times New Roman" w:cs="Times New Roman" w:eastAsia="Times New Roman" w:hAnsi="Times New Roman"/>
                 <w:color w:val="7b9726"/>
                 <w:sz w:val="24"/>
                 <w:szCs w:val="24"/>
@@ -141,7 +141,7 @@
             </w:r>
             <w:r>
               <w:rPr>
-                <w:rFonts w:ascii="Consolas" w:cs="Consolas" w:eastAsia="Consolas" w:hAnsi="Consolas"/>
+                <w:rFonts w:ascii="Times New Roman" w:cs="Times New Roman" w:eastAsia="Times New Roman" w:hAnsi="Times New Roman"/>
                 <w:color w:val="a8a19f"/>
                 <w:sz w:val="24"/>
                 <w:szCs w:val="24"/>
@@ -154,7 +154,7 @@
             </w:r>
             <w:r>
               <w:rPr>
-                <w:rFonts w:ascii="Consolas" w:cs="Consolas" w:eastAsia="Consolas" w:hAnsi="Consolas"/>
+                <w:rFonts w:ascii="Times New Roman" w:cs="Times New Roman" w:eastAsia="Times New Roman" w:hAnsi="Times New Roman"/>
                 <w:color w:val="7b9726"/>
                 <w:sz w:val="24"/>
                 <w:szCs w:val="24"/>
@@ -165,7 +165,7 @@
             </w:r>
             <w:r>
               <w:rPr>
-                <w:rFonts w:ascii="Consolas" w:cs="Consolas" w:eastAsia="Consolas" w:hAnsi="Consolas"/>
+                <w:rFonts w:ascii="Times New Roman" w:cs="Times New Roman" w:eastAsia="Times New Roman" w:hAnsi="Times New Roman"/>
                 <w:color w:val="a8a19f"/>
                 <w:sz w:val="24"/>
                 <w:szCs w:val="24"/>
@@ -181,7 +181,7 @@
             </w:r>
             <w:r>
               <w:rPr>
-                <w:rFonts w:ascii="Consolas" w:cs="Consolas" w:eastAsia="Consolas" w:hAnsi="Consolas"/>
+                <w:rFonts w:ascii="Times New Roman" w:cs="Times New Roman" w:eastAsia="Times New Roman" w:hAnsi="Times New Roman"/>
                 <w:color w:val="6666ea"/>
                 <w:sz w:val="24"/>
                 <w:szCs w:val="24"/>
@@ -192,7 +192,7 @@
             </w:r>
             <w:r>
               <w:rPr>
-                <w:rFonts w:ascii="Consolas" w:cs="Consolas" w:eastAsia="Consolas" w:hAnsi="Consolas"/>
+                <w:rFonts w:ascii="Times New Roman" w:cs="Times New Roman" w:eastAsia="Times New Roman" w:hAnsi="Times New Roman"/>
                 <w:color w:val="a8a19f"/>
                 <w:sz w:val="24"/>
                 <w:szCs w:val="24"/>
@@ -203,7 +203,7 @@
             </w:r>
             <w:r>
               <w:rPr>
-                <w:rFonts w:ascii="Consolas" w:cs="Consolas" w:eastAsia="Consolas" w:hAnsi="Consolas"/>
+                <w:rFonts w:ascii="Times New Roman" w:cs="Times New Roman" w:eastAsia="Times New Roman" w:hAnsi="Times New Roman"/>
                 <w:color w:val="df5320"/>
                 <w:sz w:val="24"/>
                 <w:szCs w:val="24"/>
@@ -214,7 +214,7 @@
             </w:r>
             <w:r>
               <w:rPr>
-                <w:rFonts w:ascii="Consolas" w:cs="Consolas" w:eastAsia="Consolas" w:hAnsi="Consolas"/>
+                <w:rFonts w:ascii="Times New Roman" w:cs="Times New Roman" w:eastAsia="Times New Roman" w:hAnsi="Times New Roman"/>
                 <w:color w:val="a8a19f"/>
                 <w:sz w:val="24"/>
                 <w:szCs w:val="24"/>
@@ -227,7 +227,7 @@
             </w:r>
             <w:r>
               <w:rPr>
-                <w:rFonts w:ascii="Consolas" w:cs="Consolas" w:eastAsia="Consolas" w:hAnsi="Consolas"/>
+                <w:rFonts w:ascii="Times New Roman" w:cs="Times New Roman" w:eastAsia="Times New Roman" w:hAnsi="Times New Roman"/>
                 <w:color w:val="df5320"/>
                 <w:sz w:val="24"/>
                 <w:szCs w:val="24"/>
@@ -238,7 +238,7 @@
             </w:r>
             <w:r>
               <w:rPr>
-                <w:rFonts w:ascii="Consolas" w:cs="Consolas" w:eastAsia="Consolas" w:hAnsi="Consolas"/>
+                <w:rFonts w:ascii="Times New Roman" w:cs="Times New Roman" w:eastAsia="Times New Roman" w:hAnsi="Times New Roman"/>
                 <w:color w:val="a8a19f"/>
                 <w:sz w:val="24"/>
                 <w:szCs w:val="24"/>
@@ -251,7 +251,7 @@
             </w:r>
             <w:r>
               <w:rPr>
-                <w:rFonts w:ascii="Consolas" w:cs="Consolas" w:eastAsia="Consolas" w:hAnsi="Consolas"/>
+                <w:rFonts w:ascii="Times New Roman" w:cs="Times New Roman" w:eastAsia="Times New Roman" w:hAnsi="Times New Roman"/>
                 <w:color w:val="df5320"/>
                 <w:sz w:val="24"/>
                 <w:szCs w:val="24"/>
@@ -262,7 +262,7 @@
             </w:r>
             <w:r>
               <w:rPr>
-                <w:rFonts w:ascii="Consolas" w:cs="Consolas" w:eastAsia="Consolas" w:hAnsi="Consolas"/>
+                <w:rFonts w:ascii="Times New Roman" w:cs="Times New Roman" w:eastAsia="Times New Roman" w:hAnsi="Times New Roman"/>
                 <w:color w:val="a8a19f"/>
                 <w:sz w:val="24"/>
                 <w:szCs w:val="24"/>
@@ -277,7 +277,7 @@
             </w:r>
             <w:r>
               <w:rPr>
-                <w:rFonts w:ascii="Consolas" w:cs="Consolas" w:eastAsia="Consolas" w:hAnsi="Consolas"/>
+                <w:rFonts w:ascii="Times New Roman" w:cs="Times New Roman" w:eastAsia="Times New Roman" w:hAnsi="Times New Roman"/>
                 <w:color w:val="6666ea"/>
                 <w:sz w:val="24"/>
                 <w:szCs w:val="24"/>
@@ -288,7 +288,7 @@
             </w:r>
             <w:r>
               <w:rPr>
-                <w:rFonts w:ascii="Consolas" w:cs="Consolas" w:eastAsia="Consolas" w:hAnsi="Consolas"/>
+                <w:rFonts w:ascii="Times New Roman" w:cs="Times New Roman" w:eastAsia="Times New Roman" w:hAnsi="Times New Roman"/>
                 <w:color w:val="a8a19f"/>
                 <w:sz w:val="24"/>
                 <w:szCs w:val="24"/>
@@ -299,7 +299,7 @@
             </w:r>
             <w:r>
               <w:rPr>
-                <w:rFonts w:ascii="Consolas" w:cs="Consolas" w:eastAsia="Consolas" w:hAnsi="Consolas"/>
+                <w:rFonts w:ascii="Times New Roman" w:cs="Times New Roman" w:eastAsia="Times New Roman" w:hAnsi="Times New Roman"/>
                 <w:color w:val="df5320"/>
                 <w:sz w:val="24"/>
                 <w:szCs w:val="24"/>
@@ -310,7 +310,7 @@
             </w:r>
             <w:r>
               <w:rPr>
-                <w:rFonts w:ascii="Consolas" w:cs="Consolas" w:eastAsia="Consolas" w:hAnsi="Consolas"/>
+                <w:rFonts w:ascii="Times New Roman" w:cs="Times New Roman" w:eastAsia="Times New Roman" w:hAnsi="Times New Roman"/>
                 <w:color w:val="a8a19f"/>
                 <w:sz w:val="24"/>
                 <w:szCs w:val="24"/>
@@ -321,7 +321,7 @@
             </w:r>
             <w:r>
               <w:rPr>
-                <w:rFonts w:ascii="Consolas" w:cs="Consolas" w:eastAsia="Consolas" w:hAnsi="Consolas"/>
+                <w:rFonts w:ascii="Times New Roman" w:cs="Times New Roman" w:eastAsia="Times New Roman" w:hAnsi="Times New Roman"/>
                 <w:color w:val="df5320"/>
                 <w:sz w:val="24"/>
                 <w:szCs w:val="24"/>
@@ -332,7 +332,7 @@
             </w:r>
             <w:r>
               <w:rPr>
-                <w:rFonts w:ascii="Consolas" w:cs="Consolas" w:eastAsia="Consolas" w:hAnsi="Consolas"/>
+                <w:rFonts w:ascii="Times New Roman" w:cs="Times New Roman" w:eastAsia="Times New Roman" w:hAnsi="Times New Roman"/>
                 <w:color w:val="a8a19f"/>
                 <w:sz w:val="24"/>
                 <w:szCs w:val="24"/>
@@ -343,7 +343,7 @@
             </w:r>
             <w:r>
               <w:rPr>
-                <w:rFonts w:ascii="Consolas" w:cs="Consolas" w:eastAsia="Consolas" w:hAnsi="Consolas"/>
+                <w:rFonts w:ascii="Times New Roman" w:cs="Times New Roman" w:eastAsia="Times New Roman" w:hAnsi="Times New Roman"/>
                 <w:color w:val="df5320"/>
                 <w:sz w:val="24"/>
                 <w:szCs w:val="24"/>
@@ -354,7 +354,7 @@
             </w:r>
             <w:r>
               <w:rPr>
-                <w:rFonts w:ascii="Consolas" w:cs="Consolas" w:eastAsia="Consolas" w:hAnsi="Consolas"/>
+                <w:rFonts w:ascii="Times New Roman" w:cs="Times New Roman" w:eastAsia="Times New Roman" w:hAnsi="Times New Roman"/>
                 <w:color w:val="a8a19f"/>
                 <w:sz w:val="24"/>
                 <w:szCs w:val="24"/>
@@ -365,7 +365,7 @@
             </w:r>
             <w:r>
               <w:rPr>
-                <w:rFonts w:ascii="Consolas" w:cs="Consolas" w:eastAsia="Consolas" w:hAnsi="Consolas"/>
+                <w:rFonts w:ascii="Times New Roman" w:cs="Times New Roman" w:eastAsia="Times New Roman" w:hAnsi="Times New Roman"/>
                 <w:color w:val="df5320"/>
                 <w:sz w:val="24"/>
                 <w:szCs w:val="24"/>
@@ -376,7 +376,7 @@
             </w:r>
             <w:r>
               <w:rPr>
-                <w:rFonts w:ascii="Consolas" w:cs="Consolas" w:eastAsia="Consolas" w:hAnsi="Consolas"/>
+                <w:rFonts w:ascii="Times New Roman" w:cs="Times New Roman" w:eastAsia="Times New Roman" w:hAnsi="Times New Roman"/>
                 <w:color w:val="a8a19f"/>
                 <w:sz w:val="24"/>
                 <w:szCs w:val="24"/>
@@ -397,7 +397,7 @@
             </w:r>
             <w:r>
               <w:rPr>
-                <w:rFonts w:ascii="Consolas" w:cs="Consolas" w:eastAsia="Consolas" w:hAnsi="Consolas"/>
+                <w:rFonts w:ascii="Times New Roman" w:cs="Times New Roman" w:eastAsia="Times New Roman" w:hAnsi="Times New Roman"/>
                 <w:color w:val="6666ea"/>
                 <w:sz w:val="24"/>
                 <w:szCs w:val="24"/>
@@ -408,7 +408,7 @@
             </w:r>
             <w:r>
               <w:rPr>
-                <w:rFonts w:ascii="Consolas" w:cs="Consolas" w:eastAsia="Consolas" w:hAnsi="Consolas"/>
+                <w:rFonts w:ascii="Times New Roman" w:cs="Times New Roman" w:eastAsia="Times New Roman" w:hAnsi="Times New Roman"/>
                 <w:color w:val="a8a19f"/>
                 <w:sz w:val="24"/>
                 <w:szCs w:val="24"/>
@@ -419,7 +419,7 @@
             </w:r>
             <w:r>
               <w:rPr>
-                <w:rFonts w:ascii="Consolas" w:cs="Consolas" w:eastAsia="Consolas" w:hAnsi="Consolas"/>
+                <w:rFonts w:ascii="Times New Roman" w:cs="Times New Roman" w:eastAsia="Times New Roman" w:hAnsi="Times New Roman"/>
                 <w:color w:val="df5320"/>
                 <w:sz w:val="24"/>
                 <w:szCs w:val="24"/>
@@ -430,7 +430,7 @@
             </w:r>
             <w:r>
               <w:rPr>
-                <w:rFonts w:ascii="Consolas" w:cs="Consolas" w:eastAsia="Consolas" w:hAnsi="Consolas"/>
+                <w:rFonts w:ascii="Times New Roman" w:cs="Times New Roman" w:eastAsia="Times New Roman" w:hAnsi="Times New Roman"/>
                 <w:color w:val="a8a19f"/>
                 <w:sz w:val="24"/>
                 <w:szCs w:val="24"/>
@@ -443,7 +443,7 @@
             </w:r>
             <w:r>
               <w:rPr>
-                <w:rFonts w:ascii="Consolas" w:cs="Consolas" w:eastAsia="Consolas" w:hAnsi="Consolas"/>
+                <w:rFonts w:ascii="Times New Roman" w:cs="Times New Roman" w:eastAsia="Times New Roman" w:hAnsi="Times New Roman"/>
                 <w:color w:val="6666ea"/>
                 <w:sz w:val="24"/>
                 <w:szCs w:val="24"/>
@@ -454,7 +454,7 @@
             </w:r>
             <w:r>
               <w:rPr>
-                <w:rFonts w:ascii="Consolas" w:cs="Consolas" w:eastAsia="Consolas" w:hAnsi="Consolas"/>
+                <w:rFonts w:ascii="Times New Roman" w:cs="Times New Roman" w:eastAsia="Times New Roman" w:hAnsi="Times New Roman"/>
                 <w:color w:val="a8a19f"/>
                 <w:sz w:val="24"/>
                 <w:szCs w:val="24"/>
@@ -465,7 +465,7 @@
             </w:r>
             <w:r>
               <w:rPr>
-                <w:rFonts w:ascii="Consolas" w:cs="Consolas" w:eastAsia="Consolas" w:hAnsi="Consolas"/>
+                <w:rFonts w:ascii="Times New Roman" w:cs="Times New Roman" w:eastAsia="Times New Roman" w:hAnsi="Times New Roman"/>
                 <w:color w:val="df5320"/>
                 <w:sz w:val="24"/>
                 <w:szCs w:val="24"/>
@@ -476,7 +476,7 @@
             </w:r>
             <w:r>
               <w:rPr>
-                <w:rFonts w:ascii="Consolas" w:cs="Consolas" w:eastAsia="Consolas" w:hAnsi="Consolas"/>
+                <w:rFonts w:ascii="Times New Roman" w:cs="Times New Roman" w:eastAsia="Times New Roman" w:hAnsi="Times New Roman"/>
                 <w:color w:val="a8a19f"/>
                 <w:sz w:val="24"/>
                 <w:szCs w:val="24"/>
@@ -489,7 +489,7 @@
             </w:r>
             <w:r>
               <w:rPr>
-                <w:rFonts w:ascii="Consolas" w:cs="Consolas" w:eastAsia="Consolas" w:hAnsi="Consolas"/>
+                <w:rFonts w:ascii="Times New Roman" w:cs="Times New Roman" w:eastAsia="Times New Roman" w:hAnsi="Times New Roman"/>
                 <w:color w:val="6666ea"/>
                 <w:sz w:val="24"/>
                 <w:szCs w:val="24"/>
@@ -500,7 +500,7 @@
             </w:r>
             <w:r>
               <w:rPr>
-                <w:rFonts w:ascii="Consolas" w:cs="Consolas" w:eastAsia="Consolas" w:hAnsi="Consolas"/>
+                <w:rFonts w:ascii="Times New Roman" w:cs="Times New Roman" w:eastAsia="Times New Roman" w:hAnsi="Times New Roman"/>
                 <w:color w:val="a8a19f"/>
                 <w:sz w:val="24"/>
                 <w:szCs w:val="24"/>
@@ -511,7 +511,7 @@
             </w:r>
             <w:r>
               <w:rPr>
-                <w:rFonts w:ascii="Consolas" w:cs="Consolas" w:eastAsia="Consolas" w:hAnsi="Consolas"/>
+                <w:rFonts w:ascii="Times New Roman" w:cs="Times New Roman" w:eastAsia="Times New Roman" w:hAnsi="Times New Roman"/>
                 <w:color w:val="df5320"/>
                 <w:sz w:val="24"/>
                 <w:szCs w:val="24"/>
@@ -522,7 +522,7 @@
             </w:r>
             <w:r>
               <w:rPr>
-                <w:rFonts w:ascii="Consolas" w:cs="Consolas" w:eastAsia="Consolas" w:hAnsi="Consolas"/>
+                <w:rFonts w:ascii="Times New Roman" w:cs="Times New Roman" w:eastAsia="Times New Roman" w:hAnsi="Times New Roman"/>
                 <w:color w:val="a8a19f"/>
                 <w:sz w:val="24"/>
                 <w:szCs w:val="24"/>
@@ -536,7 +536,7 @@
             </w:r>
             <w:r>
               <w:rPr>
-                <w:rFonts w:ascii="Consolas" w:cs="Consolas" w:eastAsia="Consolas" w:hAnsi="Consolas"/>
+                <w:rFonts w:ascii="Times New Roman" w:cs="Times New Roman" w:eastAsia="Times New Roman" w:hAnsi="Times New Roman"/>
                 <w:color w:val="df5320"/>
                 <w:sz w:val="24"/>
                 <w:szCs w:val="24"/>
@@ -547,7 +547,7 @@
             </w:r>
             <w:r>
               <w:rPr>
-                <w:rFonts w:ascii="Consolas" w:cs="Consolas" w:eastAsia="Consolas" w:hAnsi="Consolas"/>
+                <w:rFonts w:ascii="Times New Roman" w:cs="Times New Roman" w:eastAsia="Times New Roman" w:hAnsi="Times New Roman"/>
                 <w:color w:val="a8a19f"/>
                 <w:sz w:val="24"/>
                 <w:szCs w:val="24"/>
@@ -560,7 +560,7 @@
             </w:r>
             <w:r>
               <w:rPr>
-                <w:rFonts w:ascii="Consolas" w:cs="Consolas" w:eastAsia="Consolas" w:hAnsi="Consolas"/>
+                <w:rFonts w:ascii="Times New Roman" w:cs="Times New Roman" w:eastAsia="Times New Roman" w:hAnsi="Times New Roman"/>
                 <w:color w:val="df5320"/>
                 <w:sz w:val="24"/>
                 <w:szCs w:val="24"/>
@@ -571,7 +571,7 @@
             </w:r>
             <w:r>
               <w:rPr>
-                <w:rFonts w:ascii="Consolas" w:cs="Consolas" w:eastAsia="Consolas" w:hAnsi="Consolas"/>
+                <w:rFonts w:ascii="Times New Roman" w:cs="Times New Roman" w:eastAsia="Times New Roman" w:hAnsi="Times New Roman"/>
                 <w:color w:val="a8a19f"/>
                 <w:sz w:val="24"/>
                 <w:szCs w:val="24"/>
@@ -584,7 +584,7 @@
             </w:r>
             <w:r>
               <w:rPr>
-                <w:rFonts w:ascii="Consolas" w:cs="Consolas" w:eastAsia="Consolas" w:hAnsi="Consolas"/>
+                <w:rFonts w:ascii="Times New Roman" w:cs="Times New Roman" w:eastAsia="Times New Roman" w:hAnsi="Times New Roman"/>
                 <w:color w:val="df5320"/>
                 <w:sz w:val="24"/>
                 <w:szCs w:val="24"/>
@@ -595,7 +595,7 @@
             </w:r>
             <w:r>
               <w:rPr>
-                <w:rFonts w:ascii="Consolas" w:cs="Consolas" w:eastAsia="Consolas" w:hAnsi="Consolas"/>
+                <w:rFonts w:ascii="Times New Roman" w:cs="Times New Roman" w:eastAsia="Times New Roman" w:hAnsi="Times New Roman"/>
                 <w:color w:val="a8a19f"/>
                 <w:sz w:val="24"/>
                 <w:szCs w:val="24"/>
@@ -606,7 +606,7 @@
             </w:r>
             <w:r>
               <w:rPr>
-                <w:rFonts w:ascii="Consolas" w:cs="Consolas" w:eastAsia="Consolas" w:hAnsi="Consolas"/>
+                <w:rFonts w:ascii="Times New Roman" w:cs="Times New Roman" w:eastAsia="Times New Roman" w:hAnsi="Times New Roman"/>
                 <w:color w:val="df5320"/>
                 <w:sz w:val="24"/>
                 <w:szCs w:val="24"/>
@@ -617,7 +617,7 @@
             </w:r>
             <w:r>
               <w:rPr>
-                <w:rFonts w:ascii="Consolas" w:cs="Consolas" w:eastAsia="Consolas" w:hAnsi="Consolas"/>
+                <w:rFonts w:ascii="Times New Roman" w:cs="Times New Roman" w:eastAsia="Times New Roman" w:hAnsi="Times New Roman"/>
                 <w:color w:val="a8a19f"/>
                 <w:sz w:val="24"/>
                 <w:szCs w:val="24"/>
@@ -628,7 +628,7 @@
             </w:r>
             <w:r>
               <w:rPr>
-                <w:rFonts w:ascii="Consolas" w:cs="Consolas" w:eastAsia="Consolas" w:hAnsi="Consolas"/>
+                <w:rFonts w:ascii="Times New Roman" w:cs="Times New Roman" w:eastAsia="Times New Roman" w:hAnsi="Times New Roman"/>
                 <w:color w:val="df5320"/>
                 <w:sz w:val="24"/>
                 <w:szCs w:val="24"/>
@@ -639,7 +639,7 @@
             </w:r>
             <w:r>
               <w:rPr>
-                <w:rFonts w:ascii="Consolas" w:cs="Consolas" w:eastAsia="Consolas" w:hAnsi="Consolas"/>
+                <w:rFonts w:ascii="Times New Roman" w:cs="Times New Roman" w:eastAsia="Times New Roman" w:hAnsi="Times New Roman"/>
                 <w:color w:val="a8a19f"/>
                 <w:sz w:val="24"/>
                 <w:szCs w:val="24"/>
@@ -650,7 +650,7 @@
             </w:r>
             <w:r>
               <w:rPr>
-                <w:rFonts w:ascii="Consolas" w:cs="Consolas" w:eastAsia="Consolas" w:hAnsi="Consolas"/>
+                <w:rFonts w:ascii="Times New Roman" w:cs="Times New Roman" w:eastAsia="Times New Roman" w:hAnsi="Times New Roman"/>
                 <w:color w:val="df5320"/>
                 <w:sz w:val="24"/>
                 <w:szCs w:val="24"/>
@@ -661,7 +661,7 @@
             </w:r>
             <w:r>
               <w:rPr>
-                <w:rFonts w:ascii="Consolas" w:cs="Consolas" w:eastAsia="Consolas" w:hAnsi="Consolas"/>
+                <w:rFonts w:ascii="Times New Roman" w:cs="Times New Roman" w:eastAsia="Times New Roman" w:hAnsi="Times New Roman"/>
                 <w:color w:val="a8a19f"/>
                 <w:sz w:val="24"/>
                 <w:szCs w:val="24"/>
@@ -768,7 +768,7 @@
             </w:pPr>
             <w:r>
               <w:rPr>
-                <w:rFonts w:ascii="Consolas" w:cs="Consolas" w:eastAsia="Consolas" w:hAnsi="Consolas"/>
+                <w:rFonts w:ascii="Times New Roman" w:cs="Times New Roman" w:eastAsia="Times New Roman" w:hAnsi="Times New Roman"/>
                 <w:color w:val="9c9491"/>
                 <w:sz w:val="24"/>
                 <w:szCs w:val="24"/>
@@ -779,18 +779,18 @@
             </w:r>
             <w:r>
               <w:rPr>
-                <w:rFonts w:ascii="Consolas" w:cs="Consolas" w:eastAsia="Consolas" w:hAnsi="Consolas"/>
-                <w:color w:val="a8a19f"/>
-                <w:sz w:val="24"/>
-                <w:szCs w:val="24"/>
-                <w:shd w:fill="1b1918" w:val="clear"/>
-                <w:rtl w:val="0"/>
-              </w:rPr>
-              <w:br w:type="textWrapping"/>
-            </w:r>
-            <w:r>
-              <w:rPr>
-                <w:rFonts w:ascii="Consolas" w:cs="Consolas" w:eastAsia="Consolas" w:hAnsi="Consolas"/>
+                <w:rFonts w:ascii="Times New Roman" w:cs="Times New Roman" w:eastAsia="Times New Roman" w:hAnsi="Times New Roman"/>
+                <w:color w:val="a8a19f"/>
+                <w:sz w:val="24"/>
+                <w:szCs w:val="24"/>
+                <w:shd w:fill="1b1918" w:val="clear"/>
+                <w:rtl w:val="0"/>
+              </w:rPr>
+              <w:br w:type="textWrapping"/>
+            </w:r>
+            <w:r>
+              <w:rPr>
+                <w:rFonts w:ascii="Times New Roman" w:cs="Times New Roman" w:eastAsia="Times New Roman" w:hAnsi="Times New Roman"/>
                 <w:color w:val="6666ea"/>
                 <w:sz w:val="24"/>
                 <w:szCs w:val="24"/>
@@ -801,7 +801,7 @@
             </w:r>
             <w:r>
               <w:rPr>
-                <w:rFonts w:ascii="Consolas" w:cs="Consolas" w:eastAsia="Consolas" w:hAnsi="Consolas"/>
+                <w:rFonts w:ascii="Times New Roman" w:cs="Times New Roman" w:eastAsia="Times New Roman" w:hAnsi="Times New Roman"/>
                 <w:color w:val="a8a19f"/>
                 <w:sz w:val="24"/>
                 <w:szCs w:val="24"/>
@@ -814,7 +814,7 @@
             </w:r>
             <w:r>
               <w:rPr>
-                <w:rFonts w:ascii="Consolas" w:cs="Consolas" w:eastAsia="Consolas" w:hAnsi="Consolas"/>
+                <w:rFonts w:ascii="Times New Roman" w:cs="Times New Roman" w:eastAsia="Times New Roman" w:hAnsi="Times New Roman"/>
                 <w:color w:val="df5320"/>
                 <w:sz w:val="24"/>
                 <w:szCs w:val="24"/>
@@ -825,7 +825,7 @@
             </w:r>
             <w:r>
               <w:rPr>
-                <w:rFonts w:ascii="Consolas" w:cs="Consolas" w:eastAsia="Consolas" w:hAnsi="Consolas"/>
+                <w:rFonts w:ascii="Times New Roman" w:cs="Times New Roman" w:eastAsia="Times New Roman" w:hAnsi="Times New Roman"/>
                 <w:color w:val="a8a19f"/>
                 <w:sz w:val="24"/>
                 <w:szCs w:val="24"/>
@@ -836,7 +836,7 @@
             </w:r>
             <w:r>
               <w:rPr>
-                <w:rFonts w:ascii="Consolas" w:cs="Consolas" w:eastAsia="Consolas" w:hAnsi="Consolas"/>
+                <w:rFonts w:ascii="Times New Roman" w:cs="Times New Roman" w:eastAsia="Times New Roman" w:hAnsi="Times New Roman"/>
                 <w:color w:val="df5320"/>
                 <w:sz w:val="24"/>
                 <w:szCs w:val="24"/>
@@ -847,7 +847,7 @@
             </w:r>
             <w:r>
               <w:rPr>
-                <w:rFonts w:ascii="Consolas" w:cs="Consolas" w:eastAsia="Consolas" w:hAnsi="Consolas"/>
+                <w:rFonts w:ascii="Times New Roman" w:cs="Times New Roman" w:eastAsia="Times New Roman" w:hAnsi="Times New Roman"/>
                 <w:color w:val="a8a19f"/>
                 <w:sz w:val="24"/>
                 <w:szCs w:val="24"/>
@@ -858,7 +858,7 @@
             </w:r>
             <w:r>
               <w:rPr>
-                <w:rFonts w:ascii="Consolas" w:cs="Consolas" w:eastAsia="Consolas" w:hAnsi="Consolas"/>
+                <w:rFonts w:ascii="Times New Roman" w:cs="Times New Roman" w:eastAsia="Times New Roman" w:hAnsi="Times New Roman"/>
                 <w:color w:val="df5320"/>
                 <w:sz w:val="24"/>
                 <w:szCs w:val="24"/>
@@ -869,7 +869,7 @@
             </w:r>
             <w:r>
               <w:rPr>
-                <w:rFonts w:ascii="Consolas" w:cs="Consolas" w:eastAsia="Consolas" w:hAnsi="Consolas"/>
+                <w:rFonts w:ascii="Times New Roman" w:cs="Times New Roman" w:eastAsia="Times New Roman" w:hAnsi="Times New Roman"/>
                 <w:color w:val="a8a19f"/>
                 <w:sz w:val="24"/>
                 <w:szCs w:val="24"/>
@@ -880,7 +880,7 @@
             </w:r>
             <w:r>
               <w:rPr>
-                <w:rFonts w:ascii="Consolas" w:cs="Consolas" w:eastAsia="Consolas" w:hAnsi="Consolas"/>
+                <w:rFonts w:ascii="Times New Roman" w:cs="Times New Roman" w:eastAsia="Times New Roman" w:hAnsi="Times New Roman"/>
                 <w:color w:val="df5320"/>
                 <w:sz w:val="24"/>
                 <w:szCs w:val="24"/>
@@ -891,7 +891,7 @@
             </w:r>
             <w:r>
               <w:rPr>
-                <w:rFonts w:ascii="Consolas" w:cs="Consolas" w:eastAsia="Consolas" w:hAnsi="Consolas"/>
+                <w:rFonts w:ascii="Times New Roman" w:cs="Times New Roman" w:eastAsia="Times New Roman" w:hAnsi="Times New Roman"/>
                 <w:color w:val="a8a19f"/>
                 <w:sz w:val="24"/>
                 <w:szCs w:val="24"/>
@@ -902,7 +902,7 @@
             </w:r>
             <w:r>
               <w:rPr>
-                <w:rFonts w:ascii="Consolas" w:cs="Consolas" w:eastAsia="Consolas" w:hAnsi="Consolas"/>
+                <w:rFonts w:ascii="Times New Roman" w:cs="Times New Roman" w:eastAsia="Times New Roman" w:hAnsi="Times New Roman"/>
                 <w:color w:val="df5320"/>
                 <w:sz w:val="24"/>
                 <w:szCs w:val="24"/>
@@ -913,7 +913,7 @@
             </w:r>
             <w:r>
               <w:rPr>
-                <w:rFonts w:ascii="Consolas" w:cs="Consolas" w:eastAsia="Consolas" w:hAnsi="Consolas"/>
+                <w:rFonts w:ascii="Times New Roman" w:cs="Times New Roman" w:eastAsia="Times New Roman" w:hAnsi="Times New Roman"/>
                 <w:color w:val="a8a19f"/>
                 <w:sz w:val="24"/>
                 <w:szCs w:val="24"/>
@@ -924,7 +924,7 @@
             </w:r>
             <w:r>
               <w:rPr>
-                <w:rFonts w:ascii="Consolas" w:cs="Consolas" w:eastAsia="Consolas" w:hAnsi="Consolas"/>
+                <w:rFonts w:ascii="Times New Roman" w:cs="Times New Roman" w:eastAsia="Times New Roman" w:hAnsi="Times New Roman"/>
                 <w:color w:val="df5320"/>
                 <w:sz w:val="24"/>
                 <w:szCs w:val="24"/>
@@ -935,7 +935,7 @@
             </w:r>
             <w:r>
               <w:rPr>
-                <w:rFonts w:ascii="Consolas" w:cs="Consolas" w:eastAsia="Consolas" w:hAnsi="Consolas"/>
+                <w:rFonts w:ascii="Times New Roman" w:cs="Times New Roman" w:eastAsia="Times New Roman" w:hAnsi="Times New Roman"/>
                 <w:color w:val="a8a19f"/>
                 <w:sz w:val="24"/>
                 <w:szCs w:val="24"/>
@@ -946,7 +946,7 @@
             </w:r>
             <w:r>
               <w:rPr>
-                <w:rFonts w:ascii="Consolas" w:cs="Consolas" w:eastAsia="Consolas" w:hAnsi="Consolas"/>
+                <w:rFonts w:ascii="Times New Roman" w:cs="Times New Roman" w:eastAsia="Times New Roman" w:hAnsi="Times New Roman"/>
                 <w:color w:val="df5320"/>
                 <w:sz w:val="24"/>
                 <w:szCs w:val="24"/>
@@ -957,7 +957,7 @@
             </w:r>
             <w:r>
               <w:rPr>
-                <w:rFonts w:ascii="Consolas" w:cs="Consolas" w:eastAsia="Consolas" w:hAnsi="Consolas"/>
+                <w:rFonts w:ascii="Times New Roman" w:cs="Times New Roman" w:eastAsia="Times New Roman" w:hAnsi="Times New Roman"/>
                 <w:color w:val="a8a19f"/>
                 <w:sz w:val="24"/>
                 <w:szCs w:val="24"/>
@@ -968,7 +968,7 @@
             </w:r>
             <w:r>
               <w:rPr>
-                <w:rFonts w:ascii="Consolas" w:cs="Consolas" w:eastAsia="Consolas" w:hAnsi="Consolas"/>
+                <w:rFonts w:ascii="Times New Roman" w:cs="Times New Roman" w:eastAsia="Times New Roman" w:hAnsi="Times New Roman"/>
                 <w:color w:val="df5320"/>
                 <w:sz w:val="24"/>
                 <w:szCs w:val="24"/>
@@ -979,7 +979,7 @@
             </w:r>
             <w:r>
               <w:rPr>
-                <w:rFonts w:ascii="Consolas" w:cs="Consolas" w:eastAsia="Consolas" w:hAnsi="Consolas"/>
+                <w:rFonts w:ascii="Times New Roman" w:cs="Times New Roman" w:eastAsia="Times New Roman" w:hAnsi="Times New Roman"/>
                 <w:color w:val="a8a19f"/>
                 <w:sz w:val="24"/>
                 <w:szCs w:val="24"/>
@@ -990,7 +990,7 @@
             </w:r>
             <w:r>
               <w:rPr>
-                <w:rFonts w:ascii="Consolas" w:cs="Consolas" w:eastAsia="Consolas" w:hAnsi="Consolas"/>
+                <w:rFonts w:ascii="Times New Roman" w:cs="Times New Roman" w:eastAsia="Times New Roman" w:hAnsi="Times New Roman"/>
                 <w:color w:val="df5320"/>
                 <w:sz w:val="24"/>
                 <w:szCs w:val="24"/>
@@ -1001,7 +1001,7 @@
             </w:r>
             <w:r>
               <w:rPr>
-                <w:rFonts w:ascii="Consolas" w:cs="Consolas" w:eastAsia="Consolas" w:hAnsi="Consolas"/>
+                <w:rFonts w:ascii="Times New Roman" w:cs="Times New Roman" w:eastAsia="Times New Roman" w:hAnsi="Times New Roman"/>
                 <w:color w:val="a8a19f"/>
                 <w:sz w:val="24"/>
                 <w:szCs w:val="24"/>
@@ -1015,7 +1015,7 @@
             </w:r>
             <w:r>
               <w:rPr>
-                <w:rFonts w:ascii="Consolas" w:cs="Consolas" w:eastAsia="Consolas" w:hAnsi="Consolas"/>
+                <w:rFonts w:ascii="Times New Roman" w:cs="Times New Roman" w:eastAsia="Times New Roman" w:hAnsi="Times New Roman"/>
                 <w:color w:val="df5320"/>
                 <w:sz w:val="24"/>
                 <w:szCs w:val="24"/>
@@ -1026,7 +1026,7 @@
             </w:r>
             <w:r>
               <w:rPr>
-                <w:rFonts w:ascii="Consolas" w:cs="Consolas" w:eastAsia="Consolas" w:hAnsi="Consolas"/>
+                <w:rFonts w:ascii="Times New Roman" w:cs="Times New Roman" w:eastAsia="Times New Roman" w:hAnsi="Times New Roman"/>
                 <w:color w:val="a8a19f"/>
                 <w:sz w:val="24"/>
                 <w:szCs w:val="24"/>
@@ -1039,7 +1039,7 @@
             </w:r>
             <w:r>
               <w:rPr>
-                <w:rFonts w:ascii="Consolas" w:cs="Consolas" w:eastAsia="Consolas" w:hAnsi="Consolas"/>
+                <w:rFonts w:ascii="Times New Roman" w:cs="Times New Roman" w:eastAsia="Times New Roman" w:hAnsi="Times New Roman"/>
                 <w:color w:val="6666ea"/>
                 <w:sz w:val="24"/>
                 <w:szCs w:val="24"/>
@@ -1050,7 +1050,7 @@
             </w:r>
             <w:r>
               <w:rPr>
-                <w:rFonts w:ascii="Consolas" w:cs="Consolas" w:eastAsia="Consolas" w:hAnsi="Consolas"/>
+                <w:rFonts w:ascii="Times New Roman" w:cs="Times New Roman" w:eastAsia="Times New Roman" w:hAnsi="Times New Roman"/>
                 <w:color w:val="a8a19f"/>
                 <w:sz w:val="24"/>
                 <w:szCs w:val="24"/>
@@ -1061,7 +1061,7 @@
             </w:r>
             <w:r>
               <w:rPr>
-                <w:rFonts w:ascii="Consolas" w:cs="Consolas" w:eastAsia="Consolas" w:hAnsi="Consolas"/>
+                <w:rFonts w:ascii="Times New Roman" w:cs="Times New Roman" w:eastAsia="Times New Roman" w:hAnsi="Times New Roman"/>
                 <w:color w:val="df5320"/>
                 <w:sz w:val="24"/>
                 <w:szCs w:val="24"/>
@@ -1072,7 +1072,7 @@
             </w:r>
             <w:r>
               <w:rPr>
-                <w:rFonts w:ascii="Consolas" w:cs="Consolas" w:eastAsia="Consolas" w:hAnsi="Consolas"/>
+                <w:rFonts w:ascii="Times New Roman" w:cs="Times New Roman" w:eastAsia="Times New Roman" w:hAnsi="Times New Roman"/>
                 <w:color w:val="a8a19f"/>
                 <w:sz w:val="24"/>
                 <w:szCs w:val="24"/>
@@ -1083,7 +1083,7 @@
             </w:r>
             <w:r>
               <w:rPr>
-                <w:rFonts w:ascii="Consolas" w:cs="Consolas" w:eastAsia="Consolas" w:hAnsi="Consolas"/>
+                <w:rFonts w:ascii="Times New Roman" w:cs="Times New Roman" w:eastAsia="Times New Roman" w:hAnsi="Times New Roman"/>
                 <w:color w:val="df5320"/>
                 <w:sz w:val="24"/>
                 <w:szCs w:val="24"/>
@@ -1094,7 +1094,7 @@
             </w:r>
             <w:r>
               <w:rPr>
-                <w:rFonts w:ascii="Consolas" w:cs="Consolas" w:eastAsia="Consolas" w:hAnsi="Consolas"/>
+                <w:rFonts w:ascii="Times New Roman" w:cs="Times New Roman" w:eastAsia="Times New Roman" w:hAnsi="Times New Roman"/>
                 <w:color w:val="a8a19f"/>
                 <w:sz w:val="24"/>
                 <w:szCs w:val="24"/>
@@ -1107,7 +1107,7 @@
             </w:r>
             <w:r>
               <w:rPr>
-                <w:rFonts w:ascii="Consolas" w:cs="Consolas" w:eastAsia="Consolas" w:hAnsi="Consolas"/>
+                <w:rFonts w:ascii="Times New Roman" w:cs="Times New Roman" w:eastAsia="Times New Roman" w:hAnsi="Times New Roman"/>
                 <w:color w:val="6666ea"/>
                 <w:sz w:val="24"/>
                 <w:szCs w:val="24"/>
@@ -1118,7 +1118,7 @@
             </w:r>
             <w:r>
               <w:rPr>
-                <w:rFonts w:ascii="Consolas" w:cs="Consolas" w:eastAsia="Consolas" w:hAnsi="Consolas"/>
+                <w:rFonts w:ascii="Times New Roman" w:cs="Times New Roman" w:eastAsia="Times New Roman" w:hAnsi="Times New Roman"/>
                 <w:color w:val="a8a19f"/>
                 <w:sz w:val="24"/>
                 <w:szCs w:val="24"/>
@@ -1129,7 +1129,7 @@
             </w:r>
             <w:r>
               <w:rPr>
-                <w:rFonts w:ascii="Consolas" w:cs="Consolas" w:eastAsia="Consolas" w:hAnsi="Consolas"/>
+                <w:rFonts w:ascii="Times New Roman" w:cs="Times New Roman" w:eastAsia="Times New Roman" w:hAnsi="Times New Roman"/>
                 <w:color w:val="df5320"/>
                 <w:sz w:val="24"/>
                 <w:szCs w:val="24"/>
@@ -1140,7 +1140,7 @@
             </w:r>
             <w:r>
               <w:rPr>
-                <w:rFonts w:ascii="Consolas" w:cs="Consolas" w:eastAsia="Consolas" w:hAnsi="Consolas"/>
+                <w:rFonts w:ascii="Times New Roman" w:cs="Times New Roman" w:eastAsia="Times New Roman" w:hAnsi="Times New Roman"/>
                 <w:color w:val="a8a19f"/>
                 <w:sz w:val="24"/>
                 <w:szCs w:val="24"/>
@@ -1153,7 +1153,7 @@
             </w:r>
             <w:r>
               <w:rPr>
-                <w:rFonts w:ascii="Consolas" w:cs="Consolas" w:eastAsia="Consolas" w:hAnsi="Consolas"/>
+                <w:rFonts w:ascii="Times New Roman" w:cs="Times New Roman" w:eastAsia="Times New Roman" w:hAnsi="Times New Roman"/>
                 <w:color w:val="6666ea"/>
                 <w:sz w:val="24"/>
                 <w:szCs w:val="24"/>
@@ -1164,7 +1164,7 @@
             </w:r>
             <w:r>
               <w:rPr>
-                <w:rFonts w:ascii="Consolas" w:cs="Consolas" w:eastAsia="Consolas" w:hAnsi="Consolas"/>
+                <w:rFonts w:ascii="Times New Roman" w:cs="Times New Roman" w:eastAsia="Times New Roman" w:hAnsi="Times New Roman"/>
                 <w:color w:val="a8a19f"/>
                 <w:sz w:val="24"/>
                 <w:szCs w:val="24"/>
@@ -1178,7 +1178,7 @@
             </w:r>
             <w:r>
               <w:rPr>
-                <w:rFonts w:ascii="Consolas" w:cs="Consolas" w:eastAsia="Consolas" w:hAnsi="Consolas"/>
+                <w:rFonts w:ascii="Times New Roman" w:cs="Times New Roman" w:eastAsia="Times New Roman" w:hAnsi="Times New Roman"/>
                 <w:color w:val="df5320"/>
                 <w:sz w:val="24"/>
                 <w:szCs w:val="24"/>
@@ -1189,7 +1189,7 @@
             </w:r>
             <w:r>
               <w:rPr>
-                <w:rFonts w:ascii="Consolas" w:cs="Consolas" w:eastAsia="Consolas" w:hAnsi="Consolas"/>
+                <w:rFonts w:ascii="Times New Roman" w:cs="Times New Roman" w:eastAsia="Times New Roman" w:hAnsi="Times New Roman"/>
                 <w:color w:val="a8a19f"/>
                 <w:sz w:val="24"/>
                 <w:szCs w:val="24"/>
@@ -1200,7 +1200,7 @@
             </w:r>
             <w:r>
               <w:rPr>
-                <w:rFonts w:ascii="Consolas" w:cs="Consolas" w:eastAsia="Consolas" w:hAnsi="Consolas"/>
+                <w:rFonts w:ascii="Times New Roman" w:cs="Times New Roman" w:eastAsia="Times New Roman" w:hAnsi="Times New Roman"/>
                 <w:color w:val="df5320"/>
                 <w:sz w:val="24"/>
                 <w:szCs w:val="24"/>
@@ -1211,7 +1211,7 @@
             </w:r>
             <w:r>
               <w:rPr>
-                <w:rFonts w:ascii="Consolas" w:cs="Consolas" w:eastAsia="Consolas" w:hAnsi="Consolas"/>
+                <w:rFonts w:ascii="Times New Roman" w:cs="Times New Roman" w:eastAsia="Times New Roman" w:hAnsi="Times New Roman"/>
                 <w:color w:val="a8a19f"/>
                 <w:sz w:val="24"/>
                 <w:szCs w:val="24"/>
@@ -1222,7 +1222,7 @@
             </w:r>
             <w:r>
               <w:rPr>
-                <w:rFonts w:ascii="Consolas" w:cs="Consolas" w:eastAsia="Consolas" w:hAnsi="Consolas"/>
+                <w:rFonts w:ascii="Times New Roman" w:cs="Times New Roman" w:eastAsia="Times New Roman" w:hAnsi="Times New Roman"/>
                 <w:color w:val="df5320"/>
                 <w:sz w:val="24"/>
                 <w:szCs w:val="24"/>
@@ -1233,7 +1233,7 @@
             </w:r>
             <w:r>
               <w:rPr>
-                <w:rFonts w:ascii="Consolas" w:cs="Consolas" w:eastAsia="Consolas" w:hAnsi="Consolas"/>
+                <w:rFonts w:ascii="Times New Roman" w:cs="Times New Roman" w:eastAsia="Times New Roman" w:hAnsi="Times New Roman"/>
                 <w:color w:val="a8a19f"/>
                 <w:sz w:val="24"/>
                 <w:szCs w:val="24"/>
@@ -1246,7 +1246,7 @@
             </w:r>
             <w:r>
               <w:rPr>
-                <w:rFonts w:ascii="Consolas" w:cs="Consolas" w:eastAsia="Consolas" w:hAnsi="Consolas"/>
+                <w:rFonts w:ascii="Times New Roman" w:cs="Times New Roman" w:eastAsia="Times New Roman" w:hAnsi="Times New Roman"/>
                 <w:color w:val="6666ea"/>
                 <w:sz w:val="24"/>
                 <w:szCs w:val="24"/>
@@ -1257,7 +1257,7 @@
             </w:r>
             <w:r>
               <w:rPr>
-                <w:rFonts w:ascii="Consolas" w:cs="Consolas" w:eastAsia="Consolas" w:hAnsi="Consolas"/>
+                <w:rFonts w:ascii="Times New Roman" w:cs="Times New Roman" w:eastAsia="Times New Roman" w:hAnsi="Times New Roman"/>
                 <w:color w:val="a8a19f"/>
                 <w:sz w:val="24"/>
                 <w:szCs w:val="24"/>
@@ -1268,7 +1268,7 @@
             </w:r>
             <w:r>
               <w:rPr>
-                <w:rFonts w:ascii="Consolas" w:cs="Consolas" w:eastAsia="Consolas" w:hAnsi="Consolas"/>
+                <w:rFonts w:ascii="Times New Roman" w:cs="Times New Roman" w:eastAsia="Times New Roman" w:hAnsi="Times New Roman"/>
                 <w:color w:val="df5320"/>
                 <w:sz w:val="24"/>
                 <w:szCs w:val="24"/>
@@ -1279,7 +1279,7 @@
             </w:r>
             <w:r>
               <w:rPr>
-                <w:rFonts w:ascii="Consolas" w:cs="Consolas" w:eastAsia="Consolas" w:hAnsi="Consolas"/>
+                <w:rFonts w:ascii="Times New Roman" w:cs="Times New Roman" w:eastAsia="Times New Roman" w:hAnsi="Times New Roman"/>
                 <w:color w:val="a8a19f"/>
                 <w:sz w:val="24"/>
                 <w:szCs w:val="24"/>
@@ -1293,7 +1293,7 @@
             </w:r>
             <w:r>
               <w:rPr>
-                <w:rFonts w:ascii="Consolas" w:cs="Consolas" w:eastAsia="Consolas" w:hAnsi="Consolas"/>
+                <w:rFonts w:ascii="Times New Roman" w:cs="Times New Roman" w:eastAsia="Times New Roman" w:hAnsi="Times New Roman"/>
                 <w:color w:val="df5320"/>
                 <w:sz w:val="24"/>
                 <w:szCs w:val="24"/>
@@ -1304,7 +1304,7 @@
             </w:r>
             <w:r>
               <w:rPr>
-                <w:rFonts w:ascii="Consolas" w:cs="Consolas" w:eastAsia="Consolas" w:hAnsi="Consolas"/>
+                <w:rFonts w:ascii="Times New Roman" w:cs="Times New Roman" w:eastAsia="Times New Roman" w:hAnsi="Times New Roman"/>
                 <w:color w:val="a8a19f"/>
                 <w:sz w:val="24"/>
                 <w:szCs w:val="24"/>
@@ -1317,7 +1317,7 @@
             </w:r>
             <w:r>
               <w:rPr>
-                <w:rFonts w:ascii="Consolas" w:cs="Consolas" w:eastAsia="Consolas" w:hAnsi="Consolas"/>
+                <w:rFonts w:ascii="Times New Roman" w:cs="Times New Roman" w:eastAsia="Times New Roman" w:hAnsi="Times New Roman"/>
                 <w:color w:val="df5320"/>
                 <w:sz w:val="24"/>
                 <w:szCs w:val="24"/>
@@ -1328,7 +1328,7 @@
             </w:r>
             <w:r>
               <w:rPr>
-                <w:rFonts w:ascii="Consolas" w:cs="Consolas" w:eastAsia="Consolas" w:hAnsi="Consolas"/>
+                <w:rFonts w:ascii="Times New Roman" w:cs="Times New Roman" w:eastAsia="Times New Roman" w:hAnsi="Times New Roman"/>
                 <w:color w:val="a8a19f"/>
                 <w:sz w:val="24"/>
                 <w:szCs w:val="24"/>
@@ -1339,7 +1339,7 @@
             </w:r>
             <w:r>
               <w:rPr>
-                <w:rFonts w:ascii="Consolas" w:cs="Consolas" w:eastAsia="Consolas" w:hAnsi="Consolas"/>
+                <w:rFonts w:ascii="Times New Roman" w:cs="Times New Roman" w:eastAsia="Times New Roman" w:hAnsi="Times New Roman"/>
                 <w:color w:val="df5320"/>
                 <w:sz w:val="24"/>
                 <w:szCs w:val="24"/>
@@ -1350,7 +1350,7 @@
             </w:r>
             <w:r>
               <w:rPr>
-                <w:rFonts w:ascii="Consolas" w:cs="Consolas" w:eastAsia="Consolas" w:hAnsi="Consolas"/>
+                <w:rFonts w:ascii="Times New Roman" w:cs="Times New Roman" w:eastAsia="Times New Roman" w:hAnsi="Times New Roman"/>
                 <w:color w:val="a8a19f"/>
                 <w:sz w:val="24"/>
                 <w:szCs w:val="24"/>
@@ -1361,7 +1361,7 @@
             </w:r>
             <w:r>
               <w:rPr>
-                <w:rFonts w:ascii="Consolas" w:cs="Consolas" w:eastAsia="Consolas" w:hAnsi="Consolas"/>
+                <w:rFonts w:ascii="Times New Roman" w:cs="Times New Roman" w:eastAsia="Times New Roman" w:hAnsi="Times New Roman"/>
                 <w:color w:val="df5320"/>
                 <w:sz w:val="24"/>
                 <w:szCs w:val="24"/>
@@ -1372,7 +1372,7 @@
             </w:r>
             <w:r>
               <w:rPr>
-                <w:rFonts w:ascii="Consolas" w:cs="Consolas" w:eastAsia="Consolas" w:hAnsi="Consolas"/>
+                <w:rFonts w:ascii="Times New Roman" w:cs="Times New Roman" w:eastAsia="Times New Roman" w:hAnsi="Times New Roman"/>
                 <w:color w:val="a8a19f"/>
                 <w:sz w:val="24"/>
                 <w:szCs w:val="24"/>
@@ -1383,7 +1383,7 @@
             </w:r>
             <w:r>
               <w:rPr>
-                <w:rFonts w:ascii="Consolas" w:cs="Consolas" w:eastAsia="Consolas" w:hAnsi="Consolas"/>
+                <w:rFonts w:ascii="Times New Roman" w:cs="Times New Roman" w:eastAsia="Times New Roman" w:hAnsi="Times New Roman"/>
                 <w:color w:val="df5320"/>
                 <w:sz w:val="24"/>
                 <w:szCs w:val="24"/>
@@ -1394,7 +1394,7 @@
             </w:r>
             <w:r>
               <w:rPr>
-                <w:rFonts w:ascii="Consolas" w:cs="Consolas" w:eastAsia="Consolas" w:hAnsi="Consolas"/>
+                <w:rFonts w:ascii="Times New Roman" w:cs="Times New Roman" w:eastAsia="Times New Roman" w:hAnsi="Times New Roman"/>
                 <w:color w:val="a8a19f"/>
                 <w:sz w:val="24"/>
                 <w:szCs w:val="24"/>
@@ -1405,7 +1405,7 @@
             </w:r>
             <w:r>
               <w:rPr>
-                <w:rFonts w:ascii="Consolas" w:cs="Consolas" w:eastAsia="Consolas" w:hAnsi="Consolas"/>
+                <w:rFonts w:ascii="Times New Roman" w:cs="Times New Roman" w:eastAsia="Times New Roman" w:hAnsi="Times New Roman"/>
                 <w:color w:val="df5320"/>
                 <w:sz w:val="24"/>
                 <w:szCs w:val="24"/>
@@ -1416,7 +1416,7 @@
             </w:r>
             <w:r>
               <w:rPr>
-                <w:rFonts w:ascii="Consolas" w:cs="Consolas" w:eastAsia="Consolas" w:hAnsi="Consolas"/>
+                <w:rFonts w:ascii="Times New Roman" w:cs="Times New Roman" w:eastAsia="Times New Roman" w:hAnsi="Times New Roman"/>
                 <w:color w:val="a8a19f"/>
                 <w:sz w:val="24"/>
                 <w:szCs w:val="24"/>
@@ -1429,7 +1429,7 @@
             </w:r>
             <w:r>
               <w:rPr>
-                <w:rFonts w:ascii="Consolas" w:cs="Consolas" w:eastAsia="Consolas" w:hAnsi="Consolas"/>
+                <w:rFonts w:ascii="Times New Roman" w:cs="Times New Roman" w:eastAsia="Times New Roman" w:hAnsi="Times New Roman"/>
                 <w:color w:val="df5320"/>
                 <w:sz w:val="24"/>
                 <w:szCs w:val="24"/>
@@ -1440,7 +1440,7 @@
             </w:r>
             <w:r>
               <w:rPr>
-                <w:rFonts w:ascii="Consolas" w:cs="Consolas" w:eastAsia="Consolas" w:hAnsi="Consolas"/>
+                <w:rFonts w:ascii="Times New Roman" w:cs="Times New Roman" w:eastAsia="Times New Roman" w:hAnsi="Times New Roman"/>
                 <w:color w:val="a8a19f"/>
                 <w:sz w:val="24"/>
                 <w:szCs w:val="24"/>
@@ -1451,7 +1451,7 @@
             </w:r>
             <w:r>
               <w:rPr>
-                <w:rFonts w:ascii="Consolas" w:cs="Consolas" w:eastAsia="Consolas" w:hAnsi="Consolas"/>
+                <w:rFonts w:ascii="Times New Roman" w:cs="Times New Roman" w:eastAsia="Times New Roman" w:hAnsi="Times New Roman"/>
                 <w:color w:val="df5320"/>
                 <w:sz w:val="24"/>
                 <w:szCs w:val="24"/>
@@ -1462,7 +1462,7 @@
             </w:r>
             <w:r>
               <w:rPr>
-                <w:rFonts w:ascii="Consolas" w:cs="Consolas" w:eastAsia="Consolas" w:hAnsi="Consolas"/>
+                <w:rFonts w:ascii="Times New Roman" w:cs="Times New Roman" w:eastAsia="Times New Roman" w:hAnsi="Times New Roman"/>
                 <w:color w:val="a8a19f"/>
                 <w:sz w:val="24"/>
                 <w:szCs w:val="24"/>
@@ -1473,7 +1473,7 @@
             </w:r>
             <w:r>
               <w:rPr>
-                <w:rFonts w:ascii="Consolas" w:cs="Consolas" w:eastAsia="Consolas" w:hAnsi="Consolas"/>
+                <w:rFonts w:ascii="Times New Roman" w:cs="Times New Roman" w:eastAsia="Times New Roman" w:hAnsi="Times New Roman"/>
                 <w:color w:val="df5320"/>
                 <w:sz w:val="24"/>
                 <w:szCs w:val="24"/>
@@ -1484,7 +1484,7 @@
             </w:r>
             <w:r>
               <w:rPr>
-                <w:rFonts w:ascii="Consolas" w:cs="Consolas" w:eastAsia="Consolas" w:hAnsi="Consolas"/>
+                <w:rFonts w:ascii="Times New Roman" w:cs="Times New Roman" w:eastAsia="Times New Roman" w:hAnsi="Times New Roman"/>
                 <w:color w:val="a8a19f"/>
                 <w:sz w:val="24"/>
                 <w:szCs w:val="24"/>
@@ -1495,7 +1495,7 @@
             </w:r>
             <w:r>
               <w:rPr>
-                <w:rFonts w:ascii="Consolas" w:cs="Consolas" w:eastAsia="Consolas" w:hAnsi="Consolas"/>
+                <w:rFonts w:ascii="Times New Roman" w:cs="Times New Roman" w:eastAsia="Times New Roman" w:hAnsi="Times New Roman"/>
                 <w:color w:val="df5320"/>
                 <w:sz w:val="24"/>
                 <w:szCs w:val="24"/>
@@ -1506,7 +1506,7 @@
             </w:r>
             <w:r>
               <w:rPr>
-                <w:rFonts w:ascii="Consolas" w:cs="Consolas" w:eastAsia="Consolas" w:hAnsi="Consolas"/>
+                <w:rFonts w:ascii="Times New Roman" w:cs="Times New Roman" w:eastAsia="Times New Roman" w:hAnsi="Times New Roman"/>
                 <w:color w:val="a8a19f"/>
                 <w:sz w:val="24"/>
                 <w:szCs w:val="24"/>
@@ -1519,7 +1519,7 @@
             </w:r>
             <w:r>
               <w:rPr>
-                <w:rFonts w:ascii="Consolas" w:cs="Consolas" w:eastAsia="Consolas" w:hAnsi="Consolas"/>
+                <w:rFonts w:ascii="Times New Roman" w:cs="Times New Roman" w:eastAsia="Times New Roman" w:hAnsi="Times New Roman"/>
                 <w:color w:val="df5320"/>
                 <w:sz w:val="24"/>
                 <w:szCs w:val="24"/>
@@ -1530,7 +1530,7 @@
             </w:r>
             <w:r>
               <w:rPr>
-                <w:rFonts w:ascii="Consolas" w:cs="Consolas" w:eastAsia="Consolas" w:hAnsi="Consolas"/>
+                <w:rFonts w:ascii="Times New Roman" w:cs="Times New Roman" w:eastAsia="Times New Roman" w:hAnsi="Times New Roman"/>
                 <w:color w:val="a8a19f"/>
                 <w:sz w:val="24"/>
                 <w:szCs w:val="24"/>
@@ -1541,7 +1541,7 @@
             </w:r>
             <w:r>
               <w:rPr>
-                <w:rFonts w:ascii="Consolas" w:cs="Consolas" w:eastAsia="Consolas" w:hAnsi="Consolas"/>
+                <w:rFonts w:ascii="Times New Roman" w:cs="Times New Roman" w:eastAsia="Times New Roman" w:hAnsi="Times New Roman"/>
                 <w:color w:val="df5320"/>
                 <w:sz w:val="24"/>
                 <w:szCs w:val="24"/>
@@ -1552,7 +1552,7 @@
             </w:r>
             <w:r>
               <w:rPr>
-                <w:rFonts w:ascii="Consolas" w:cs="Consolas" w:eastAsia="Consolas" w:hAnsi="Consolas"/>
+                <w:rFonts w:ascii="Times New Roman" w:cs="Times New Roman" w:eastAsia="Times New Roman" w:hAnsi="Times New Roman"/>
                 <w:color w:val="a8a19f"/>
                 <w:sz w:val="24"/>
                 <w:szCs w:val="24"/>
@@ -1567,7 +1567,7 @@
             </w:r>
             <w:r>
               <w:rPr>
-                <w:rFonts w:ascii="Consolas" w:cs="Consolas" w:eastAsia="Consolas" w:hAnsi="Consolas"/>
+                <w:rFonts w:ascii="Times New Roman" w:cs="Times New Roman" w:eastAsia="Times New Roman" w:hAnsi="Times New Roman"/>
                 <w:color w:val="df5320"/>
                 <w:sz w:val="24"/>
                 <w:szCs w:val="24"/>
@@ -1578,7 +1578,7 @@
             </w:r>
             <w:r>
               <w:rPr>
-                <w:rFonts w:ascii="Consolas" w:cs="Consolas" w:eastAsia="Consolas" w:hAnsi="Consolas"/>
+                <w:rFonts w:ascii="Times New Roman" w:cs="Times New Roman" w:eastAsia="Times New Roman" w:hAnsi="Times New Roman"/>
                 <w:color w:val="a8a19f"/>
                 <w:sz w:val="24"/>
                 <w:szCs w:val="24"/>
@@ -1589,7 +1589,7 @@
             </w:r>
             <w:r>
               <w:rPr>
-                <w:rFonts w:ascii="Consolas" w:cs="Consolas" w:eastAsia="Consolas" w:hAnsi="Consolas"/>
+                <w:rFonts w:ascii="Times New Roman" w:cs="Times New Roman" w:eastAsia="Times New Roman" w:hAnsi="Times New Roman"/>
                 <w:color w:val="df5320"/>
                 <w:sz w:val="24"/>
                 <w:szCs w:val="24"/>
@@ -1600,7 +1600,7 @@
             </w:r>
             <w:r>
               <w:rPr>
-                <w:rFonts w:ascii="Consolas" w:cs="Consolas" w:eastAsia="Consolas" w:hAnsi="Consolas"/>
+                <w:rFonts w:ascii="Times New Roman" w:cs="Times New Roman" w:eastAsia="Times New Roman" w:hAnsi="Times New Roman"/>
                 <w:color w:val="a8a19f"/>
                 <w:sz w:val="24"/>
                 <w:szCs w:val="24"/>
@@ -1611,7 +1611,7 @@
             </w:r>
             <w:r>
               <w:rPr>
-                <w:rFonts w:ascii="Consolas" w:cs="Consolas" w:eastAsia="Consolas" w:hAnsi="Consolas"/>
+                <w:rFonts w:ascii="Times New Roman" w:cs="Times New Roman" w:eastAsia="Times New Roman" w:hAnsi="Times New Roman"/>
                 <w:color w:val="df5320"/>
                 <w:sz w:val="24"/>
                 <w:szCs w:val="24"/>
@@ -1622,7 +1622,7 @@
             </w:r>
             <w:r>
               <w:rPr>
-                <w:rFonts w:ascii="Consolas" w:cs="Consolas" w:eastAsia="Consolas" w:hAnsi="Consolas"/>
+                <w:rFonts w:ascii="Times New Roman" w:cs="Times New Roman" w:eastAsia="Times New Roman" w:hAnsi="Times New Roman"/>
                 <w:color w:val="a8a19f"/>
                 <w:sz w:val="24"/>
                 <w:szCs w:val="24"/>
@@ -1633,7 +1633,7 @@
             </w:r>
             <w:r>
               <w:rPr>
-                <w:rFonts w:ascii="Consolas" w:cs="Consolas" w:eastAsia="Consolas" w:hAnsi="Consolas"/>
+                <w:rFonts w:ascii="Times New Roman" w:cs="Times New Roman" w:eastAsia="Times New Roman" w:hAnsi="Times New Roman"/>
                 <w:color w:val="df5320"/>
                 <w:sz w:val="24"/>
                 <w:szCs w:val="24"/>
@@ -1644,7 +1644,7 @@
             </w:r>
             <w:r>
               <w:rPr>
-                <w:rFonts w:ascii="Consolas" w:cs="Consolas" w:eastAsia="Consolas" w:hAnsi="Consolas"/>
+                <w:rFonts w:ascii="Times New Roman" w:cs="Times New Roman" w:eastAsia="Times New Roman" w:hAnsi="Times New Roman"/>
                 <w:color w:val="a8a19f"/>
                 <w:sz w:val="24"/>
                 <w:szCs w:val="24"/>
@@ -1655,7 +1655,7 @@
             </w:r>
             <w:r>
               <w:rPr>
-                <w:rFonts w:ascii="Consolas" w:cs="Consolas" w:eastAsia="Consolas" w:hAnsi="Consolas"/>
+                <w:rFonts w:ascii="Times New Roman" w:cs="Times New Roman" w:eastAsia="Times New Roman" w:hAnsi="Times New Roman"/>
                 <w:color w:val="df5320"/>
                 <w:sz w:val="24"/>
                 <w:szCs w:val="24"/>
@@ -1666,7 +1666,7 @@
             </w:r>
             <w:r>
               <w:rPr>
-                <w:rFonts w:ascii="Consolas" w:cs="Consolas" w:eastAsia="Consolas" w:hAnsi="Consolas"/>
+                <w:rFonts w:ascii="Times New Roman" w:cs="Times New Roman" w:eastAsia="Times New Roman" w:hAnsi="Times New Roman"/>
                 <w:color w:val="a8a19f"/>
                 <w:sz w:val="24"/>
                 <w:szCs w:val="24"/>
@@ -1677,7 +1677,7 @@
             </w:r>
             <w:r>
               <w:rPr>
-                <w:rFonts w:ascii="Consolas" w:cs="Consolas" w:eastAsia="Consolas" w:hAnsi="Consolas"/>
+                <w:rFonts w:ascii="Times New Roman" w:cs="Times New Roman" w:eastAsia="Times New Roman" w:hAnsi="Times New Roman"/>
                 <w:color w:val="df5320"/>
                 <w:sz w:val="24"/>
                 <w:szCs w:val="24"/>
@@ -1688,7 +1688,7 @@
             </w:r>
             <w:r>
               <w:rPr>
-                <w:rFonts w:ascii="Consolas" w:cs="Consolas" w:eastAsia="Consolas" w:hAnsi="Consolas"/>
+                <w:rFonts w:ascii="Times New Roman" w:cs="Times New Roman" w:eastAsia="Times New Roman" w:hAnsi="Times New Roman"/>
                 <w:color w:val="a8a19f"/>
                 <w:sz w:val="24"/>
                 <w:szCs w:val="24"/>
@@ -1699,7 +1699,7 @@
             </w:r>
             <w:r>
               <w:rPr>
-                <w:rFonts w:ascii="Consolas" w:cs="Consolas" w:eastAsia="Consolas" w:hAnsi="Consolas"/>
+                <w:rFonts w:ascii="Times New Roman" w:cs="Times New Roman" w:eastAsia="Times New Roman" w:hAnsi="Times New Roman"/>
                 <w:color w:val="9c9491"/>
                 <w:sz w:val="24"/>
                 <w:szCs w:val="24"/>
@@ -1710,7 +1710,7 @@
             </w:r>
             <w:r>
               <w:rPr>
-                <w:rFonts w:ascii="Consolas" w:cs="Consolas" w:eastAsia="Consolas" w:hAnsi="Consolas"/>
+                <w:rFonts w:ascii="Times New Roman" w:cs="Times New Roman" w:eastAsia="Times New Roman" w:hAnsi="Times New Roman"/>
                 <w:color w:val="a8a19f"/>
                 <w:sz w:val="24"/>
                 <w:szCs w:val="24"/>
@@ -1816,7 +1816,7 @@
             </w:pPr>
             <w:r>
               <w:rPr>
-                <w:rFonts w:ascii="Consolas" w:cs="Consolas" w:eastAsia="Consolas" w:hAnsi="Consolas"/>
+                <w:rFonts w:ascii="Times New Roman" w:cs="Times New Roman" w:eastAsia="Times New Roman" w:hAnsi="Times New Roman"/>
                 <w:color w:val="6666ea"/>
                 <w:sz w:val="24"/>
                 <w:szCs w:val="24"/>
@@ -1827,7 +1827,7 @@
             </w:r>
             <w:r>
               <w:rPr>
-                <w:rFonts w:ascii="Consolas" w:cs="Consolas" w:eastAsia="Consolas" w:hAnsi="Consolas"/>
+                <w:rFonts w:ascii="Times New Roman" w:cs="Times New Roman" w:eastAsia="Times New Roman" w:hAnsi="Times New Roman"/>
                 <w:color w:val="a8a19f"/>
                 <w:sz w:val="24"/>
                 <w:szCs w:val="24"/>
@@ -1838,7 +1838,7 @@
             </w:r>
             <w:r>
               <w:rPr>
-                <w:rFonts w:ascii="Consolas" w:cs="Consolas" w:eastAsia="Consolas" w:hAnsi="Consolas"/>
+                <w:rFonts w:ascii="Times New Roman" w:cs="Times New Roman" w:eastAsia="Times New Roman" w:hAnsi="Times New Roman"/>
                 <w:color w:val="df5320"/>
                 <w:sz w:val="24"/>
                 <w:szCs w:val="24"/>
@@ -1849,7 +1849,7 @@
             </w:r>
             <w:r>
               <w:rPr>
-                <w:rFonts w:ascii="Consolas" w:cs="Consolas" w:eastAsia="Consolas" w:hAnsi="Consolas"/>
+                <w:rFonts w:ascii="Times New Roman" w:cs="Times New Roman" w:eastAsia="Times New Roman" w:hAnsi="Times New Roman"/>
                 <w:color w:val="a8a19f"/>
                 <w:sz w:val="24"/>
                 <w:szCs w:val="24"/>
@@ -1860,7 +1860,7 @@
             </w:r>
             <w:r>
               <w:rPr>
-                <w:rFonts w:ascii="Consolas" w:cs="Consolas" w:eastAsia="Consolas" w:hAnsi="Consolas"/>
+                <w:rFonts w:ascii="Times New Roman" w:cs="Times New Roman" w:eastAsia="Times New Roman" w:hAnsi="Times New Roman"/>
                 <w:color w:val="df5320"/>
                 <w:sz w:val="24"/>
                 <w:szCs w:val="24"/>
@@ -1871,7 +1871,7 @@
             </w:r>
             <w:r>
               <w:rPr>
-                <w:rFonts w:ascii="Consolas" w:cs="Consolas" w:eastAsia="Consolas" w:hAnsi="Consolas"/>
+                <w:rFonts w:ascii="Times New Roman" w:cs="Times New Roman" w:eastAsia="Times New Roman" w:hAnsi="Times New Roman"/>
                 <w:color w:val="a8a19f"/>
                 <w:sz w:val="24"/>
                 <w:szCs w:val="24"/>
@@ -1884,7 +1884,7 @@
             </w:r>
             <w:r>
               <w:rPr>
-                <w:rFonts w:ascii="Consolas" w:cs="Consolas" w:eastAsia="Consolas" w:hAnsi="Consolas"/>
+                <w:rFonts w:ascii="Times New Roman" w:cs="Times New Roman" w:eastAsia="Times New Roman" w:hAnsi="Times New Roman"/>
                 <w:color w:val="df5320"/>
                 <w:sz w:val="24"/>
                 <w:szCs w:val="24"/>
@@ -1895,7 +1895,7 @@
             </w:r>
             <w:r>
               <w:rPr>
-                <w:rFonts w:ascii="Consolas" w:cs="Consolas" w:eastAsia="Consolas" w:hAnsi="Consolas"/>
+                <w:rFonts w:ascii="Times New Roman" w:cs="Times New Roman" w:eastAsia="Times New Roman" w:hAnsi="Times New Roman"/>
                 <w:color w:val="a8a19f"/>
                 <w:sz w:val="24"/>
                 <w:szCs w:val="24"/>
@@ -1908,7 +1908,7 @@
             </w:r>
             <w:r>
               <w:rPr>
-                <w:rFonts w:ascii="Consolas" w:cs="Consolas" w:eastAsia="Consolas" w:hAnsi="Consolas"/>
+                <w:rFonts w:ascii="Times New Roman" w:cs="Times New Roman" w:eastAsia="Times New Roman" w:hAnsi="Times New Roman"/>
                 <w:color w:val="6666ea"/>
                 <w:sz w:val="24"/>
                 <w:szCs w:val="24"/>
@@ -1919,7 +1919,7 @@
             </w:r>
             <w:r>
               <w:rPr>
-                <w:rFonts w:ascii="Consolas" w:cs="Consolas" w:eastAsia="Consolas" w:hAnsi="Consolas"/>
+                <w:rFonts w:ascii="Times New Roman" w:cs="Times New Roman" w:eastAsia="Times New Roman" w:hAnsi="Times New Roman"/>
                 <w:color w:val="a8a19f"/>
                 <w:sz w:val="24"/>
                 <w:szCs w:val="24"/>
@@ -1930,7 +1930,7 @@
             </w:r>
             <w:r>
               <w:rPr>
-                <w:rFonts w:ascii="Consolas" w:cs="Consolas" w:eastAsia="Consolas" w:hAnsi="Consolas"/>
+                <w:rFonts w:ascii="Times New Roman" w:cs="Times New Roman" w:eastAsia="Times New Roman" w:hAnsi="Times New Roman"/>
                 <w:color w:val="df5320"/>
                 <w:sz w:val="24"/>
                 <w:szCs w:val="24"/>
@@ -1941,7 +1941,7 @@
             </w:r>
             <w:r>
               <w:rPr>
-                <w:rFonts w:ascii="Consolas" w:cs="Consolas" w:eastAsia="Consolas" w:hAnsi="Consolas"/>
+                <w:rFonts w:ascii="Times New Roman" w:cs="Times New Roman" w:eastAsia="Times New Roman" w:hAnsi="Times New Roman"/>
                 <w:color w:val="a8a19f"/>
                 <w:sz w:val="24"/>
                 <w:szCs w:val="24"/>
@@ -1952,7 +1952,7 @@
             </w:r>
             <w:r>
               <w:rPr>
-                <w:rFonts w:ascii="Consolas" w:cs="Consolas" w:eastAsia="Consolas" w:hAnsi="Consolas"/>
+                <w:rFonts w:ascii="Times New Roman" w:cs="Times New Roman" w:eastAsia="Times New Roman" w:hAnsi="Times New Roman"/>
                 <w:color w:val="df5320"/>
                 <w:sz w:val="24"/>
                 <w:szCs w:val="24"/>
@@ -1963,7 +1963,7 @@
             </w:r>
             <w:r>
               <w:rPr>
-                <w:rFonts w:ascii="Consolas" w:cs="Consolas" w:eastAsia="Consolas" w:hAnsi="Consolas"/>
+                <w:rFonts w:ascii="Times New Roman" w:cs="Times New Roman" w:eastAsia="Times New Roman" w:hAnsi="Times New Roman"/>
                 <w:color w:val="a8a19f"/>
                 <w:sz w:val="24"/>
                 <w:szCs w:val="24"/>
@@ -1976,7 +1976,7 @@
             </w:r>
             <w:r>
               <w:rPr>
-                <w:rFonts w:ascii="Consolas" w:cs="Consolas" w:eastAsia="Consolas" w:hAnsi="Consolas"/>
+                <w:rFonts w:ascii="Times New Roman" w:cs="Times New Roman" w:eastAsia="Times New Roman" w:hAnsi="Times New Roman"/>
                 <w:color w:val="6666ea"/>
                 <w:sz w:val="24"/>
                 <w:szCs w:val="24"/>
@@ -1987,7 +1987,7 @@
             </w:r>
             <w:r>
               <w:rPr>
-                <w:rFonts w:ascii="Consolas" w:cs="Consolas" w:eastAsia="Consolas" w:hAnsi="Consolas"/>
+                <w:rFonts w:ascii="Times New Roman" w:cs="Times New Roman" w:eastAsia="Times New Roman" w:hAnsi="Times New Roman"/>
                 <w:color w:val="a8a19f"/>
                 <w:sz w:val="24"/>
                 <w:szCs w:val="24"/>
@@ -1998,7 +1998,7 @@
             </w:r>
             <w:r>
               <w:rPr>
-                <w:rFonts w:ascii="Consolas" w:cs="Consolas" w:eastAsia="Consolas" w:hAnsi="Consolas"/>
+                <w:rFonts w:ascii="Times New Roman" w:cs="Times New Roman" w:eastAsia="Times New Roman" w:hAnsi="Times New Roman"/>
                 <w:color w:val="df5320"/>
                 <w:sz w:val="24"/>
                 <w:szCs w:val="24"/>
@@ -2009,7 +2009,7 @@
             </w:r>
             <w:r>
               <w:rPr>
-                <w:rFonts w:ascii="Consolas" w:cs="Consolas" w:eastAsia="Consolas" w:hAnsi="Consolas"/>
+                <w:rFonts w:ascii="Times New Roman" w:cs="Times New Roman" w:eastAsia="Times New Roman" w:hAnsi="Times New Roman"/>
                 <w:color w:val="a8a19f"/>
                 <w:sz w:val="24"/>
                 <w:szCs w:val="24"/>
@@ -2020,7 +2020,7 @@
             </w:r>
             <w:r>
               <w:rPr>
-                <w:rFonts w:ascii="Consolas" w:cs="Consolas" w:eastAsia="Consolas" w:hAnsi="Consolas"/>
+                <w:rFonts w:ascii="Times New Roman" w:cs="Times New Roman" w:eastAsia="Times New Roman" w:hAnsi="Times New Roman"/>
                 <w:color w:val="df5320"/>
                 <w:sz w:val="24"/>
                 <w:szCs w:val="24"/>
@@ -2031,7 +2031,7 @@
             </w:r>
             <w:r>
               <w:rPr>
-                <w:rFonts w:ascii="Consolas" w:cs="Consolas" w:eastAsia="Consolas" w:hAnsi="Consolas"/>
+                <w:rFonts w:ascii="Times New Roman" w:cs="Times New Roman" w:eastAsia="Times New Roman" w:hAnsi="Times New Roman"/>
                 <w:color w:val="a8a19f"/>
                 <w:sz w:val="24"/>
                 <w:szCs w:val="24"/>
@@ -2049,7 +2049,7 @@
             </w:r>
             <w:r>
               <w:rPr>
-                <w:rFonts w:ascii="Consolas" w:cs="Consolas" w:eastAsia="Consolas" w:hAnsi="Consolas"/>
+                <w:rFonts w:ascii="Times New Roman" w:cs="Times New Roman" w:eastAsia="Times New Roman" w:hAnsi="Times New Roman"/>
                 <w:color w:val="df5320"/>
                 <w:sz w:val="24"/>
                 <w:szCs w:val="24"/>
@@ -2060,7 +2060,7 @@
             </w:r>
             <w:r>
               <w:rPr>
-                <w:rFonts w:ascii="Consolas" w:cs="Consolas" w:eastAsia="Consolas" w:hAnsi="Consolas"/>
+                <w:rFonts w:ascii="Times New Roman" w:cs="Times New Roman" w:eastAsia="Times New Roman" w:hAnsi="Times New Roman"/>
                 <w:color w:val="a8a19f"/>
                 <w:sz w:val="24"/>
                 <w:szCs w:val="24"/>
@@ -2071,7 +2071,7 @@
             </w:r>
             <w:r>
               <w:rPr>
-                <w:rFonts w:ascii="Consolas" w:cs="Consolas" w:eastAsia="Consolas" w:hAnsi="Consolas"/>
+                <w:rFonts w:ascii="Times New Roman" w:cs="Times New Roman" w:eastAsia="Times New Roman" w:hAnsi="Times New Roman"/>
                 <w:color w:val="df5320"/>
                 <w:sz w:val="24"/>
                 <w:szCs w:val="24"/>
@@ -2082,7 +2082,7 @@
             </w:r>
             <w:r>
               <w:rPr>
-                <w:rFonts w:ascii="Consolas" w:cs="Consolas" w:eastAsia="Consolas" w:hAnsi="Consolas"/>
+                <w:rFonts w:ascii="Times New Roman" w:cs="Times New Roman" w:eastAsia="Times New Roman" w:hAnsi="Times New Roman"/>
                 <w:color w:val="a8a19f"/>
                 <w:sz w:val="24"/>
                 <w:szCs w:val="24"/>
@@ -2093,7 +2093,7 @@
             </w:r>
             <w:r>
               <w:rPr>
-                <w:rFonts w:ascii="Consolas" w:cs="Consolas" w:eastAsia="Consolas" w:hAnsi="Consolas"/>
+                <w:rFonts w:ascii="Times New Roman" w:cs="Times New Roman" w:eastAsia="Times New Roman" w:hAnsi="Times New Roman"/>
                 <w:color w:val="df5320"/>
                 <w:sz w:val="24"/>
                 <w:szCs w:val="24"/>
@@ -2104,7 +2104,7 @@
             </w:r>
             <w:r>
               <w:rPr>
-                <w:rFonts w:ascii="Consolas" w:cs="Consolas" w:eastAsia="Consolas" w:hAnsi="Consolas"/>
+                <w:rFonts w:ascii="Times New Roman" w:cs="Times New Roman" w:eastAsia="Times New Roman" w:hAnsi="Times New Roman"/>
                 <w:color w:val="a8a19f"/>
                 <w:sz w:val="24"/>
                 <w:szCs w:val="24"/>
@@ -2119,7 +2119,7 @@
             </w:r>
             <w:r>
               <w:rPr>
-                <w:rFonts w:ascii="Consolas" w:cs="Consolas" w:eastAsia="Consolas" w:hAnsi="Consolas"/>
+                <w:rFonts w:ascii="Times New Roman" w:cs="Times New Roman" w:eastAsia="Times New Roman" w:hAnsi="Times New Roman"/>
                 <w:color w:val="9c9491"/>
                 <w:sz w:val="24"/>
                 <w:szCs w:val="24"/>
@@ -2130,18 +2130,18 @@
             </w:r>
             <w:r>
               <w:rPr>
-                <w:rFonts w:ascii="Consolas" w:cs="Consolas" w:eastAsia="Consolas" w:hAnsi="Consolas"/>
-                <w:color w:val="a8a19f"/>
-                <w:sz w:val="24"/>
-                <w:szCs w:val="24"/>
-                <w:shd w:fill="1b1918" w:val="clear"/>
-                <w:rtl w:val="0"/>
-              </w:rPr>
-              <w:br w:type="textWrapping"/>
-            </w:r>
-            <w:r>
-              <w:rPr>
-                <w:rFonts w:ascii="Consolas" w:cs="Consolas" w:eastAsia="Consolas" w:hAnsi="Consolas"/>
+                <w:rFonts w:ascii="Times New Roman" w:cs="Times New Roman" w:eastAsia="Times New Roman" w:hAnsi="Times New Roman"/>
+                <w:color w:val="a8a19f"/>
+                <w:sz w:val="24"/>
+                <w:szCs w:val="24"/>
+                <w:shd w:fill="1b1918" w:val="clear"/>
+                <w:rtl w:val="0"/>
+              </w:rPr>
+              <w:br w:type="textWrapping"/>
+            </w:r>
+            <w:r>
+              <w:rPr>
+                <w:rFonts w:ascii="Times New Roman" w:cs="Times New Roman" w:eastAsia="Times New Roman" w:hAnsi="Times New Roman"/>
                 <w:color w:val="9c9491"/>
                 <w:sz w:val="24"/>
                 <w:szCs w:val="24"/>
@@ -2152,18 +2152,18 @@
             </w:r>
             <w:r>
               <w:rPr>
-                <w:rFonts w:ascii="Consolas" w:cs="Consolas" w:eastAsia="Consolas" w:hAnsi="Consolas"/>
-                <w:color w:val="a8a19f"/>
-                <w:sz w:val="24"/>
-                <w:szCs w:val="24"/>
-                <w:shd w:fill="1b1918" w:val="clear"/>
-                <w:rtl w:val="0"/>
-              </w:rPr>
-              <w:br w:type="textWrapping"/>
-            </w:r>
-            <w:r>
-              <w:rPr>
-                <w:rFonts w:ascii="Consolas" w:cs="Consolas" w:eastAsia="Consolas" w:hAnsi="Consolas"/>
+                <w:rFonts w:ascii="Times New Roman" w:cs="Times New Roman" w:eastAsia="Times New Roman" w:hAnsi="Times New Roman"/>
+                <w:color w:val="a8a19f"/>
+                <w:sz w:val="24"/>
+                <w:szCs w:val="24"/>
+                <w:shd w:fill="1b1918" w:val="clear"/>
+                <w:rtl w:val="0"/>
+              </w:rPr>
+              <w:br w:type="textWrapping"/>
+            </w:r>
+            <w:r>
+              <w:rPr>
+                <w:rFonts w:ascii="Times New Roman" w:cs="Times New Roman" w:eastAsia="Times New Roman" w:hAnsi="Times New Roman"/>
                 <w:color w:val="6666ea"/>
                 <w:sz w:val="24"/>
                 <w:szCs w:val="24"/>
@@ -2174,7 +2174,7 @@
             </w:r>
             <w:r>
               <w:rPr>
-                <w:rFonts w:ascii="Consolas" w:cs="Consolas" w:eastAsia="Consolas" w:hAnsi="Consolas"/>
+                <w:rFonts w:ascii="Times New Roman" w:cs="Times New Roman" w:eastAsia="Times New Roman" w:hAnsi="Times New Roman"/>
                 <w:color w:val="a8a19f"/>
                 <w:sz w:val="24"/>
                 <w:szCs w:val="24"/>
@@ -2185,7 +2185,7 @@
             </w:r>
             <w:r>
               <w:rPr>
-                <w:rFonts w:ascii="Consolas" w:cs="Consolas" w:eastAsia="Consolas" w:hAnsi="Consolas"/>
+                <w:rFonts w:ascii="Times New Roman" w:cs="Times New Roman" w:eastAsia="Times New Roman" w:hAnsi="Times New Roman"/>
                 <w:color w:val="df5320"/>
                 <w:sz w:val="24"/>
                 <w:szCs w:val="24"/>
@@ -2196,7 +2196,7 @@
             </w:r>
             <w:r>
               <w:rPr>
-                <w:rFonts w:ascii="Consolas" w:cs="Consolas" w:eastAsia="Consolas" w:hAnsi="Consolas"/>
+                <w:rFonts w:ascii="Times New Roman" w:cs="Times New Roman" w:eastAsia="Times New Roman" w:hAnsi="Times New Roman"/>
                 <w:color w:val="a8a19f"/>
                 <w:sz w:val="24"/>
                 <w:szCs w:val="24"/>
@@ -2207,7 +2207,7 @@
             </w:r>
             <w:r>
               <w:rPr>
-                <w:rFonts w:ascii="Consolas" w:cs="Consolas" w:eastAsia="Consolas" w:hAnsi="Consolas"/>
+                <w:rFonts w:ascii="Times New Roman" w:cs="Times New Roman" w:eastAsia="Times New Roman" w:hAnsi="Times New Roman"/>
                 <w:color w:val="df5320"/>
                 <w:sz w:val="24"/>
                 <w:szCs w:val="24"/>
@@ -2218,7 +2218,7 @@
             </w:r>
             <w:r>
               <w:rPr>
-                <w:rFonts w:ascii="Consolas" w:cs="Consolas" w:eastAsia="Consolas" w:hAnsi="Consolas"/>
+                <w:rFonts w:ascii="Times New Roman" w:cs="Times New Roman" w:eastAsia="Times New Roman" w:hAnsi="Times New Roman"/>
                 <w:color w:val="a8a19f"/>
                 <w:sz w:val="24"/>
                 <w:szCs w:val="24"/>
@@ -2229,7 +2229,7 @@
             </w:r>
             <w:r>
               <w:rPr>
-                <w:rFonts w:ascii="Consolas" w:cs="Consolas" w:eastAsia="Consolas" w:hAnsi="Consolas"/>
+                <w:rFonts w:ascii="Times New Roman" w:cs="Times New Roman" w:eastAsia="Times New Roman" w:hAnsi="Times New Roman"/>
                 <w:color w:val="df5320"/>
                 <w:sz w:val="24"/>
                 <w:szCs w:val="24"/>
@@ -2240,7 +2240,7 @@
             </w:r>
             <w:r>
               <w:rPr>
-                <w:rFonts w:ascii="Consolas" w:cs="Consolas" w:eastAsia="Consolas" w:hAnsi="Consolas"/>
+                <w:rFonts w:ascii="Times New Roman" w:cs="Times New Roman" w:eastAsia="Times New Roman" w:hAnsi="Times New Roman"/>
                 <w:color w:val="a8a19f"/>
                 <w:sz w:val="24"/>
                 <w:szCs w:val="24"/>
@@ -2251,7 +2251,7 @@
             </w:r>
             <w:r>
               <w:rPr>
-                <w:rFonts w:ascii="Consolas" w:cs="Consolas" w:eastAsia="Consolas" w:hAnsi="Consolas"/>
+                <w:rFonts w:ascii="Times New Roman" w:cs="Times New Roman" w:eastAsia="Times New Roman" w:hAnsi="Times New Roman"/>
                 <w:color w:val="df5320"/>
                 <w:sz w:val="24"/>
                 <w:szCs w:val="24"/>
@@ -2262,7 +2262,7 @@
             </w:r>
             <w:r>
               <w:rPr>
-                <w:rFonts w:ascii="Consolas" w:cs="Consolas" w:eastAsia="Consolas" w:hAnsi="Consolas"/>
+                <w:rFonts w:ascii="Times New Roman" w:cs="Times New Roman" w:eastAsia="Times New Roman" w:hAnsi="Times New Roman"/>
                 <w:color w:val="a8a19f"/>
                 <w:sz w:val="24"/>
                 <w:szCs w:val="24"/>
@@ -2275,7 +2275,7 @@
             </w:r>
             <w:r>
               <w:rPr>
-                <w:rFonts w:ascii="Consolas" w:cs="Consolas" w:eastAsia="Consolas" w:hAnsi="Consolas"/>
+                <w:rFonts w:ascii="Times New Roman" w:cs="Times New Roman" w:eastAsia="Times New Roman" w:hAnsi="Times New Roman"/>
                 <w:color w:val="df5320"/>
                 <w:sz w:val="24"/>
                 <w:szCs w:val="24"/>
@@ -2286,7 +2286,7 @@
             </w:r>
             <w:r>
               <w:rPr>
-                <w:rFonts w:ascii="Consolas" w:cs="Consolas" w:eastAsia="Consolas" w:hAnsi="Consolas"/>
+                <w:rFonts w:ascii="Times New Roman" w:cs="Times New Roman" w:eastAsia="Times New Roman" w:hAnsi="Times New Roman"/>
                 <w:color w:val="a8a19f"/>
                 <w:sz w:val="24"/>
                 <w:szCs w:val="24"/>
@@ -2299,7 +2299,7 @@
             </w:r>
             <w:r>
               <w:rPr>
-                <w:rFonts w:ascii="Consolas" w:cs="Consolas" w:eastAsia="Consolas" w:hAnsi="Consolas"/>
+                <w:rFonts w:ascii="Times New Roman" w:cs="Times New Roman" w:eastAsia="Times New Roman" w:hAnsi="Times New Roman"/>
                 <w:color w:val="6666ea"/>
                 <w:sz w:val="24"/>
                 <w:szCs w:val="24"/>
@@ -2310,7 +2310,7 @@
             </w:r>
             <w:r>
               <w:rPr>
-                <w:rFonts w:ascii="Consolas" w:cs="Consolas" w:eastAsia="Consolas" w:hAnsi="Consolas"/>
+                <w:rFonts w:ascii="Times New Roman" w:cs="Times New Roman" w:eastAsia="Times New Roman" w:hAnsi="Times New Roman"/>
                 <w:color w:val="a8a19f"/>
                 <w:sz w:val="24"/>
                 <w:szCs w:val="24"/>
@@ -2323,7 +2323,7 @@
             </w:r>
             <w:r>
               <w:rPr>
-                <w:rFonts w:ascii="Consolas" w:cs="Consolas" w:eastAsia="Consolas" w:hAnsi="Consolas"/>
+                <w:rFonts w:ascii="Times New Roman" w:cs="Times New Roman" w:eastAsia="Times New Roman" w:hAnsi="Times New Roman"/>
                 <w:color w:val="df5320"/>
                 <w:sz w:val="24"/>
                 <w:szCs w:val="24"/>
@@ -2334,7 +2334,7 @@
             </w:r>
             <w:r>
               <w:rPr>
-                <w:rFonts w:ascii="Consolas" w:cs="Consolas" w:eastAsia="Consolas" w:hAnsi="Consolas"/>
+                <w:rFonts w:ascii="Times New Roman" w:cs="Times New Roman" w:eastAsia="Times New Roman" w:hAnsi="Times New Roman"/>
                 <w:color w:val="a8a19f"/>
                 <w:sz w:val="24"/>
                 <w:szCs w:val="24"/>
@@ -2345,7 +2345,7 @@
             </w:r>
             <w:r>
               <w:rPr>
-                <w:rFonts w:ascii="Consolas" w:cs="Consolas" w:eastAsia="Consolas" w:hAnsi="Consolas"/>
+                <w:rFonts w:ascii="Times New Roman" w:cs="Times New Roman" w:eastAsia="Times New Roman" w:hAnsi="Times New Roman"/>
                 <w:color w:val="df5320"/>
                 <w:sz w:val="24"/>
                 <w:szCs w:val="24"/>
@@ -2356,7 +2356,7 @@
             </w:r>
             <w:r>
               <w:rPr>
-                <w:rFonts w:ascii="Consolas" w:cs="Consolas" w:eastAsia="Consolas" w:hAnsi="Consolas"/>
+                <w:rFonts w:ascii="Times New Roman" w:cs="Times New Roman" w:eastAsia="Times New Roman" w:hAnsi="Times New Roman"/>
                 <w:color w:val="a8a19f"/>
                 <w:sz w:val="24"/>
                 <w:szCs w:val="24"/>
@@ -2371,7 +2371,7 @@
             </w:r>
             <w:r>
               <w:rPr>
-                <w:rFonts w:ascii="Consolas" w:cs="Consolas" w:eastAsia="Consolas" w:hAnsi="Consolas"/>
+                <w:rFonts w:ascii="Times New Roman" w:cs="Times New Roman" w:eastAsia="Times New Roman" w:hAnsi="Times New Roman"/>
                 <w:color w:val="6666ea"/>
                 <w:sz w:val="24"/>
                 <w:szCs w:val="24"/>
@@ -2382,7 +2382,7 @@
             </w:r>
             <w:r>
               <w:rPr>
-                <w:rFonts w:ascii="Consolas" w:cs="Consolas" w:eastAsia="Consolas" w:hAnsi="Consolas"/>
+                <w:rFonts w:ascii="Times New Roman" w:cs="Times New Roman" w:eastAsia="Times New Roman" w:hAnsi="Times New Roman"/>
                 <w:color w:val="a8a19f"/>
                 <w:sz w:val="24"/>
                 <w:szCs w:val="24"/>
@@ -2393,7 +2393,7 @@
             </w:r>
             <w:r>
               <w:rPr>
-                <w:rFonts w:ascii="Consolas" w:cs="Consolas" w:eastAsia="Consolas" w:hAnsi="Consolas"/>
+                <w:rFonts w:ascii="Times New Roman" w:cs="Times New Roman" w:eastAsia="Times New Roman" w:hAnsi="Times New Roman"/>
                 <w:color w:val="df5320"/>
                 <w:sz w:val="24"/>
                 <w:szCs w:val="24"/>
@@ -2404,7 +2404,7 @@
             </w:r>
             <w:r>
               <w:rPr>
-                <w:rFonts w:ascii="Consolas" w:cs="Consolas" w:eastAsia="Consolas" w:hAnsi="Consolas"/>
+                <w:rFonts w:ascii="Times New Roman" w:cs="Times New Roman" w:eastAsia="Times New Roman" w:hAnsi="Times New Roman"/>
                 <w:color w:val="a8a19f"/>
                 <w:sz w:val="24"/>
                 <w:szCs w:val="24"/>
@@ -2420,7 +2420,7 @@
             </w:r>
             <w:r>
               <w:rPr>
-                <w:rFonts w:ascii="Consolas" w:cs="Consolas" w:eastAsia="Consolas" w:hAnsi="Consolas"/>
+                <w:rFonts w:ascii="Times New Roman" w:cs="Times New Roman" w:eastAsia="Times New Roman" w:hAnsi="Times New Roman"/>
                 <w:color w:val="df5320"/>
                 <w:sz w:val="24"/>
                 <w:szCs w:val="24"/>
@@ -2431,7 +2431,7 @@
             </w:r>
             <w:r>
               <w:rPr>
-                <w:rFonts w:ascii="Consolas" w:cs="Consolas" w:eastAsia="Consolas" w:hAnsi="Consolas"/>
+                <w:rFonts w:ascii="Times New Roman" w:cs="Times New Roman" w:eastAsia="Times New Roman" w:hAnsi="Times New Roman"/>
                 <w:color w:val="a8a19f"/>
                 <w:sz w:val="24"/>
                 <w:szCs w:val="24"/>
@@ -2442,7 +2442,7 @@
             </w:r>
             <w:r>
               <w:rPr>
-                <w:rFonts w:ascii="Consolas" w:cs="Consolas" w:eastAsia="Consolas" w:hAnsi="Consolas"/>
+                <w:rFonts w:ascii="Times New Roman" w:cs="Times New Roman" w:eastAsia="Times New Roman" w:hAnsi="Times New Roman"/>
                 <w:color w:val="df5320"/>
                 <w:sz w:val="24"/>
                 <w:szCs w:val="24"/>
@@ -2453,7 +2453,7 @@
             </w:r>
             <w:r>
               <w:rPr>
-                <w:rFonts w:ascii="Consolas" w:cs="Consolas" w:eastAsia="Consolas" w:hAnsi="Consolas"/>
+                <w:rFonts w:ascii="Times New Roman" w:cs="Times New Roman" w:eastAsia="Times New Roman" w:hAnsi="Times New Roman"/>
                 <w:color w:val="a8a19f"/>
                 <w:sz w:val="24"/>
                 <w:szCs w:val="24"/>
@@ -2464,7 +2464,7 @@
             </w:r>
             <w:r>
               <w:rPr>
-                <w:rFonts w:ascii="Consolas" w:cs="Consolas" w:eastAsia="Consolas" w:hAnsi="Consolas"/>
+                <w:rFonts w:ascii="Times New Roman" w:cs="Times New Roman" w:eastAsia="Times New Roman" w:hAnsi="Times New Roman"/>
                 <w:color w:val="df5320"/>
                 <w:sz w:val="24"/>
                 <w:szCs w:val="24"/>
@@ -2475,7 +2475,7 @@
             </w:r>
             <w:r>
               <w:rPr>
-                <w:rFonts w:ascii="Consolas" w:cs="Consolas" w:eastAsia="Consolas" w:hAnsi="Consolas"/>
+                <w:rFonts w:ascii="Times New Roman" w:cs="Times New Roman" w:eastAsia="Times New Roman" w:hAnsi="Times New Roman"/>
                 <w:color w:val="a8a19f"/>
                 <w:sz w:val="24"/>
                 <w:szCs w:val="24"/>
@@ -2486,7 +2486,7 @@
             </w:r>
             <w:r>
               <w:rPr>
-                <w:rFonts w:ascii="Consolas" w:cs="Consolas" w:eastAsia="Consolas" w:hAnsi="Consolas"/>
+                <w:rFonts w:ascii="Times New Roman" w:cs="Times New Roman" w:eastAsia="Times New Roman" w:hAnsi="Times New Roman"/>
                 <w:color w:val="df5320"/>
                 <w:sz w:val="24"/>
                 <w:szCs w:val="24"/>
@@ -2497,7 +2497,7 @@
             </w:r>
             <w:r>
               <w:rPr>
-                <w:rFonts w:ascii="Consolas" w:cs="Consolas" w:eastAsia="Consolas" w:hAnsi="Consolas"/>
+                <w:rFonts w:ascii="Times New Roman" w:cs="Times New Roman" w:eastAsia="Times New Roman" w:hAnsi="Times New Roman"/>
                 <w:color w:val="a8a19f"/>
                 <w:sz w:val="24"/>
                 <w:szCs w:val="24"/>
@@ -2604,7 +2604,7 @@
             </w:pPr>
             <w:r>
               <w:rPr>
-                <w:rFonts w:ascii="Consolas" w:cs="Consolas" w:eastAsia="Consolas" w:hAnsi="Consolas"/>
+                <w:rFonts w:ascii="Times New Roman" w:cs="Times New Roman" w:eastAsia="Times New Roman" w:hAnsi="Times New Roman"/>
                 <w:color w:val="a8a19f"/>
                 <w:sz w:val="24"/>
                 <w:szCs w:val="24"/>
@@ -2615,7 +2615,7 @@
             </w:r>
             <w:r>
               <w:rPr>
-                <w:rFonts w:ascii="Consolas" w:cs="Consolas" w:eastAsia="Consolas" w:hAnsi="Consolas"/>
+                <w:rFonts w:ascii="Times New Roman" w:cs="Times New Roman" w:eastAsia="Times New Roman" w:hAnsi="Times New Roman"/>
                 <w:color w:val="df5320"/>
                 <w:sz w:val="24"/>
                 <w:szCs w:val="24"/>
@@ -2626,7 +2626,7 @@
             </w:r>
             <w:r>
               <w:rPr>
-                <w:rFonts w:ascii="Consolas" w:cs="Consolas" w:eastAsia="Consolas" w:hAnsi="Consolas"/>
+                <w:rFonts w:ascii="Times New Roman" w:cs="Times New Roman" w:eastAsia="Times New Roman" w:hAnsi="Times New Roman"/>
                 <w:color w:val="a8a19f"/>
                 <w:sz w:val="24"/>
                 <w:szCs w:val="24"/>
@@ -2637,7 +2637,7 @@
             </w:r>
             <w:r>
               <w:rPr>
-                <w:rFonts w:ascii="Consolas" w:cs="Consolas" w:eastAsia="Consolas" w:hAnsi="Consolas"/>
+                <w:rFonts w:ascii="Times New Roman" w:cs="Times New Roman" w:eastAsia="Times New Roman" w:hAnsi="Times New Roman"/>
                 <w:color w:val="df5320"/>
                 <w:sz w:val="24"/>
                 <w:szCs w:val="24"/>
@@ -2648,7 +2648,7 @@
             </w:r>
             <w:r>
               <w:rPr>
-                <w:rFonts w:ascii="Consolas" w:cs="Consolas" w:eastAsia="Consolas" w:hAnsi="Consolas"/>
+                <w:rFonts w:ascii="Times New Roman" w:cs="Times New Roman" w:eastAsia="Times New Roman" w:hAnsi="Times New Roman"/>
                 <w:color w:val="a8a19f"/>
                 <w:sz w:val="24"/>
                 <w:szCs w:val="24"/>
@@ -2661,7 +2661,7 @@
             </w:r>
             <w:r>
               <w:rPr>
-                <w:rFonts w:ascii="Consolas" w:cs="Consolas" w:eastAsia="Consolas" w:hAnsi="Consolas"/>
+                <w:rFonts w:ascii="Times New Roman" w:cs="Times New Roman" w:eastAsia="Times New Roman" w:hAnsi="Times New Roman"/>
                 <w:color w:val="df5320"/>
                 <w:sz w:val="24"/>
                 <w:szCs w:val="24"/>
@@ -2672,7 +2672,7 @@
             </w:r>
             <w:r>
               <w:rPr>
-                <w:rFonts w:ascii="Consolas" w:cs="Consolas" w:eastAsia="Consolas" w:hAnsi="Consolas"/>
+                <w:rFonts w:ascii="Times New Roman" w:cs="Times New Roman" w:eastAsia="Times New Roman" w:hAnsi="Times New Roman"/>
                 <w:color w:val="a8a19f"/>
                 <w:sz w:val="24"/>
                 <w:szCs w:val="24"/>
@@ -2686,7 +2686,7 @@
             </w:r>
             <w:r>
               <w:rPr>
-                <w:rFonts w:ascii="Consolas" w:cs="Consolas" w:eastAsia="Consolas" w:hAnsi="Consolas"/>
+                <w:rFonts w:ascii="Times New Roman" w:cs="Times New Roman" w:eastAsia="Times New Roman" w:hAnsi="Times New Roman"/>
                 <w:color w:val="6666ea"/>
                 <w:sz w:val="24"/>
                 <w:szCs w:val="24"/>
@@ -2697,7 +2697,7 @@
             </w:r>
             <w:r>
               <w:rPr>
-                <w:rFonts w:ascii="Consolas" w:cs="Consolas" w:eastAsia="Consolas" w:hAnsi="Consolas"/>
+                <w:rFonts w:ascii="Times New Roman" w:cs="Times New Roman" w:eastAsia="Times New Roman" w:hAnsi="Times New Roman"/>
                 <w:color w:val="a8a19f"/>
                 <w:sz w:val="24"/>
                 <w:szCs w:val="24"/>
@@ -2708,7 +2708,7 @@
             </w:r>
             <w:r>
               <w:rPr>
-                <w:rFonts w:ascii="Consolas" w:cs="Consolas" w:eastAsia="Consolas" w:hAnsi="Consolas"/>
+                <w:rFonts w:ascii="Times New Roman" w:cs="Times New Roman" w:eastAsia="Times New Roman" w:hAnsi="Times New Roman"/>
                 <w:color w:val="df5320"/>
                 <w:sz w:val="24"/>
                 <w:szCs w:val="24"/>
@@ -2719,7 +2719,7 @@
             </w:r>
             <w:r>
               <w:rPr>
-                <w:rFonts w:ascii="Consolas" w:cs="Consolas" w:eastAsia="Consolas" w:hAnsi="Consolas"/>
+                <w:rFonts w:ascii="Times New Roman" w:cs="Times New Roman" w:eastAsia="Times New Roman" w:hAnsi="Times New Roman"/>
                 <w:color w:val="a8a19f"/>
                 <w:sz w:val="24"/>
                 <w:szCs w:val="24"/>
@@ -2730,7 +2730,7 @@
             </w:r>
             <w:r>
               <w:rPr>
-                <w:rFonts w:ascii="Consolas" w:cs="Consolas" w:eastAsia="Consolas" w:hAnsi="Consolas"/>
+                <w:rFonts w:ascii="Times New Roman" w:cs="Times New Roman" w:eastAsia="Times New Roman" w:hAnsi="Times New Roman"/>
                 <w:color w:val="df5320"/>
                 <w:sz w:val="24"/>
                 <w:szCs w:val="24"/>
@@ -2741,7 +2741,7 @@
             </w:r>
             <w:r>
               <w:rPr>
-                <w:rFonts w:ascii="Consolas" w:cs="Consolas" w:eastAsia="Consolas" w:hAnsi="Consolas"/>
+                <w:rFonts w:ascii="Times New Roman" w:cs="Times New Roman" w:eastAsia="Times New Roman" w:hAnsi="Times New Roman"/>
                 <w:color w:val="a8a19f"/>
                 <w:sz w:val="24"/>
                 <w:szCs w:val="24"/>
@@ -2752,7 +2752,7 @@
             </w:r>
             <w:r>
               <w:rPr>
-                <w:rFonts w:ascii="Consolas" w:cs="Consolas" w:eastAsia="Consolas" w:hAnsi="Consolas"/>
+                <w:rFonts w:ascii="Times New Roman" w:cs="Times New Roman" w:eastAsia="Times New Roman" w:hAnsi="Times New Roman"/>
                 <w:color w:val="df5320"/>
                 <w:sz w:val="24"/>
                 <w:szCs w:val="24"/>
@@ -2763,7 +2763,7 @@
             </w:r>
             <w:r>
               <w:rPr>
-                <w:rFonts w:ascii="Consolas" w:cs="Consolas" w:eastAsia="Consolas" w:hAnsi="Consolas"/>
+                <w:rFonts w:ascii="Times New Roman" w:cs="Times New Roman" w:eastAsia="Times New Roman" w:hAnsi="Times New Roman"/>
                 <w:color w:val="a8a19f"/>
                 <w:sz w:val="24"/>
                 <w:szCs w:val="24"/>
@@ -2774,7 +2774,7 @@
             </w:r>
             <w:r>
               <w:rPr>
-                <w:rFonts w:ascii="Consolas" w:cs="Consolas" w:eastAsia="Consolas" w:hAnsi="Consolas"/>
+                <w:rFonts w:ascii="Times New Roman" w:cs="Times New Roman" w:eastAsia="Times New Roman" w:hAnsi="Times New Roman"/>
                 <w:color w:val="df5320"/>
                 <w:sz w:val="24"/>
                 <w:szCs w:val="24"/>
@@ -2785,7 +2785,7 @@
             </w:r>
             <w:r>
               <w:rPr>
-                <w:rFonts w:ascii="Consolas" w:cs="Consolas" w:eastAsia="Consolas" w:hAnsi="Consolas"/>
+                <w:rFonts w:ascii="Times New Roman" w:cs="Times New Roman" w:eastAsia="Times New Roman" w:hAnsi="Times New Roman"/>
                 <w:color w:val="a8a19f"/>
                 <w:sz w:val="24"/>
                 <w:szCs w:val="24"/>
@@ -2798,7 +2798,7 @@
             </w:r>
             <w:r>
               <w:rPr>
-                <w:rFonts w:ascii="Consolas" w:cs="Consolas" w:eastAsia="Consolas" w:hAnsi="Consolas"/>
+                <w:rFonts w:ascii="Times New Roman" w:cs="Times New Roman" w:eastAsia="Times New Roman" w:hAnsi="Times New Roman"/>
                 <w:color w:val="6666ea"/>
                 <w:sz w:val="24"/>
                 <w:szCs w:val="24"/>
@@ -2809,7 +2809,7 @@
             </w:r>
             <w:r>
               <w:rPr>
-                <w:rFonts w:ascii="Consolas" w:cs="Consolas" w:eastAsia="Consolas" w:hAnsi="Consolas"/>
+                <w:rFonts w:ascii="Times New Roman" w:cs="Times New Roman" w:eastAsia="Times New Roman" w:hAnsi="Times New Roman"/>
                 <w:color w:val="a8a19f"/>
                 <w:sz w:val="24"/>
                 <w:szCs w:val="24"/>
@@ -2820,7 +2820,7 @@
             </w:r>
             <w:r>
               <w:rPr>
-                <w:rFonts w:ascii="Consolas" w:cs="Consolas" w:eastAsia="Consolas" w:hAnsi="Consolas"/>
+                <w:rFonts w:ascii="Times New Roman" w:cs="Times New Roman" w:eastAsia="Times New Roman" w:hAnsi="Times New Roman"/>
                 <w:color w:val="df5320"/>
                 <w:sz w:val="24"/>
                 <w:szCs w:val="24"/>
@@ -2831,7 +2831,7 @@
             </w:r>
             <w:r>
               <w:rPr>
-                <w:rFonts w:ascii="Consolas" w:cs="Consolas" w:eastAsia="Consolas" w:hAnsi="Consolas"/>
+                <w:rFonts w:ascii="Times New Roman" w:cs="Times New Roman" w:eastAsia="Times New Roman" w:hAnsi="Times New Roman"/>
                 <w:color w:val="a8a19f"/>
                 <w:sz w:val="24"/>
                 <w:szCs w:val="24"/>
@@ -2842,7 +2842,7 @@
             </w:r>
             <w:r>
               <w:rPr>
-                <w:rFonts w:ascii="Consolas" w:cs="Consolas" w:eastAsia="Consolas" w:hAnsi="Consolas"/>
+                <w:rFonts w:ascii="Times New Roman" w:cs="Times New Roman" w:eastAsia="Times New Roman" w:hAnsi="Times New Roman"/>
                 <w:color w:val="df5320"/>
                 <w:sz w:val="24"/>
                 <w:szCs w:val="24"/>
@@ -2853,7 +2853,7 @@
             </w:r>
             <w:r>
               <w:rPr>
-                <w:rFonts w:ascii="Consolas" w:cs="Consolas" w:eastAsia="Consolas" w:hAnsi="Consolas"/>
+                <w:rFonts w:ascii="Times New Roman" w:cs="Times New Roman" w:eastAsia="Times New Roman" w:hAnsi="Times New Roman"/>
                 <w:color w:val="a8a19f"/>
                 <w:sz w:val="24"/>
                 <w:szCs w:val="24"/>
@@ -2864,7 +2864,7 @@
             </w:r>
             <w:r>
               <w:rPr>
-                <w:rFonts w:ascii="Consolas" w:cs="Consolas" w:eastAsia="Consolas" w:hAnsi="Consolas"/>
+                <w:rFonts w:ascii="Times New Roman" w:cs="Times New Roman" w:eastAsia="Times New Roman" w:hAnsi="Times New Roman"/>
                 <w:color w:val="df5320"/>
                 <w:sz w:val="24"/>
                 <w:szCs w:val="24"/>
@@ -2875,7 +2875,7 @@
             </w:r>
             <w:r>
               <w:rPr>
-                <w:rFonts w:ascii="Consolas" w:cs="Consolas" w:eastAsia="Consolas" w:hAnsi="Consolas"/>
+                <w:rFonts w:ascii="Times New Roman" w:cs="Times New Roman" w:eastAsia="Times New Roman" w:hAnsi="Times New Roman"/>
                 <w:color w:val="a8a19f"/>
                 <w:sz w:val="24"/>
                 <w:szCs w:val="24"/>
@@ -2886,7 +2886,7 @@
             </w:r>
             <w:r>
               <w:rPr>
-                <w:rFonts w:ascii="Consolas" w:cs="Consolas" w:eastAsia="Consolas" w:hAnsi="Consolas"/>
+                <w:rFonts w:ascii="Times New Roman" w:cs="Times New Roman" w:eastAsia="Times New Roman" w:hAnsi="Times New Roman"/>
                 <w:color w:val="df5320"/>
                 <w:sz w:val="24"/>
                 <w:szCs w:val="24"/>
@@ -2897,7 +2897,7 @@
             </w:r>
             <w:r>
               <w:rPr>
-                <w:rFonts w:ascii="Consolas" w:cs="Consolas" w:eastAsia="Consolas" w:hAnsi="Consolas"/>
+                <w:rFonts w:ascii="Times New Roman" w:cs="Times New Roman" w:eastAsia="Times New Roman" w:hAnsi="Times New Roman"/>
                 <w:color w:val="a8a19f"/>
                 <w:sz w:val="24"/>
                 <w:szCs w:val="24"/>
@@ -2910,7 +2910,7 @@
             </w:r>
             <w:r>
               <w:rPr>
-                <w:rFonts w:ascii="Consolas" w:cs="Consolas" w:eastAsia="Consolas" w:hAnsi="Consolas"/>
+                <w:rFonts w:ascii="Times New Roman" w:cs="Times New Roman" w:eastAsia="Times New Roman" w:hAnsi="Times New Roman"/>
                 <w:color w:val="6666ea"/>
                 <w:sz w:val="24"/>
                 <w:szCs w:val="24"/>
@@ -2921,7 +2921,7 @@
             </w:r>
             <w:r>
               <w:rPr>
-                <w:rFonts w:ascii="Consolas" w:cs="Consolas" w:eastAsia="Consolas" w:hAnsi="Consolas"/>
+                <w:rFonts w:ascii="Times New Roman" w:cs="Times New Roman" w:eastAsia="Times New Roman" w:hAnsi="Times New Roman"/>
                 <w:color w:val="a8a19f"/>
                 <w:sz w:val="24"/>
                 <w:szCs w:val="24"/>
@@ -2932,7 +2932,7 @@
             </w:r>
             <w:r>
               <w:rPr>
-                <w:rFonts w:ascii="Consolas" w:cs="Consolas" w:eastAsia="Consolas" w:hAnsi="Consolas"/>
+                <w:rFonts w:ascii="Times New Roman" w:cs="Times New Roman" w:eastAsia="Times New Roman" w:hAnsi="Times New Roman"/>
                 <w:color w:val="df5320"/>
                 <w:sz w:val="24"/>
                 <w:szCs w:val="24"/>
@@ -2943,7 +2943,7 @@
             </w:r>
             <w:r>
               <w:rPr>
-                <w:rFonts w:ascii="Consolas" w:cs="Consolas" w:eastAsia="Consolas" w:hAnsi="Consolas"/>
+                <w:rFonts w:ascii="Times New Roman" w:cs="Times New Roman" w:eastAsia="Times New Roman" w:hAnsi="Times New Roman"/>
                 <w:color w:val="a8a19f"/>
                 <w:sz w:val="24"/>
                 <w:szCs w:val="24"/>
@@ -2954,7 +2954,7 @@
             </w:r>
             <w:r>
               <w:rPr>
-                <w:rFonts w:ascii="Consolas" w:cs="Consolas" w:eastAsia="Consolas" w:hAnsi="Consolas"/>
+                <w:rFonts w:ascii="Times New Roman" w:cs="Times New Roman" w:eastAsia="Times New Roman" w:hAnsi="Times New Roman"/>
                 <w:color w:val="df5320"/>
                 <w:sz w:val="24"/>
                 <w:szCs w:val="24"/>
@@ -2965,7 +2965,7 @@
             </w:r>
             <w:r>
               <w:rPr>
-                <w:rFonts w:ascii="Consolas" w:cs="Consolas" w:eastAsia="Consolas" w:hAnsi="Consolas"/>
+                <w:rFonts w:ascii="Times New Roman" w:cs="Times New Roman" w:eastAsia="Times New Roman" w:hAnsi="Times New Roman"/>
                 <w:color w:val="a8a19f"/>
                 <w:sz w:val="24"/>
                 <w:szCs w:val="24"/>
@@ -2976,7 +2976,7 @@
             </w:r>
             <w:r>
               <w:rPr>
-                <w:rFonts w:ascii="Consolas" w:cs="Consolas" w:eastAsia="Consolas" w:hAnsi="Consolas"/>
+                <w:rFonts w:ascii="Times New Roman" w:cs="Times New Roman" w:eastAsia="Times New Roman" w:hAnsi="Times New Roman"/>
                 <w:color w:val="df5320"/>
                 <w:sz w:val="24"/>
                 <w:szCs w:val="24"/>
@@ -2987,7 +2987,7 @@
             </w:r>
             <w:r>
               <w:rPr>
-                <w:rFonts w:ascii="Consolas" w:cs="Consolas" w:eastAsia="Consolas" w:hAnsi="Consolas"/>
+                <w:rFonts w:ascii="Times New Roman" w:cs="Times New Roman" w:eastAsia="Times New Roman" w:hAnsi="Times New Roman"/>
                 <w:color w:val="a8a19f"/>
                 <w:sz w:val="24"/>
                 <w:szCs w:val="24"/>
@@ -3000,7 +3000,7 @@
             </w:r>
             <w:r>
               <w:rPr>
-                <w:rFonts w:ascii="Consolas" w:cs="Consolas" w:eastAsia="Consolas" w:hAnsi="Consolas"/>
+                <w:rFonts w:ascii="Times New Roman" w:cs="Times New Roman" w:eastAsia="Times New Roman" w:hAnsi="Times New Roman"/>
                 <w:color w:val="6666ea"/>
                 <w:sz w:val="24"/>
                 <w:szCs w:val="24"/>
@@ -3011,7 +3011,7 @@
             </w:r>
             <w:r>
               <w:rPr>
-                <w:rFonts w:ascii="Consolas" w:cs="Consolas" w:eastAsia="Consolas" w:hAnsi="Consolas"/>
+                <w:rFonts w:ascii="Times New Roman" w:cs="Times New Roman" w:eastAsia="Times New Roman" w:hAnsi="Times New Roman"/>
                 <w:color w:val="a8a19f"/>
                 <w:sz w:val="24"/>
                 <w:szCs w:val="24"/>
@@ -3022,7 +3022,7 @@
             </w:r>
             <w:r>
               <w:rPr>
-                <w:rFonts w:ascii="Consolas" w:cs="Consolas" w:eastAsia="Consolas" w:hAnsi="Consolas"/>
+                <w:rFonts w:ascii="Times New Roman" w:cs="Times New Roman" w:eastAsia="Times New Roman" w:hAnsi="Times New Roman"/>
                 <w:color w:val="df5320"/>
                 <w:sz w:val="24"/>
                 <w:szCs w:val="24"/>
@@ -3033,7 +3033,7 @@
             </w:r>
             <w:r>
               <w:rPr>
-                <w:rFonts w:ascii="Consolas" w:cs="Consolas" w:eastAsia="Consolas" w:hAnsi="Consolas"/>
+                <w:rFonts w:ascii="Times New Roman" w:cs="Times New Roman" w:eastAsia="Times New Roman" w:hAnsi="Times New Roman"/>
                 <w:color w:val="a8a19f"/>
                 <w:sz w:val="24"/>
                 <w:szCs w:val="24"/>
@@ -3044,7 +3044,7 @@
             </w:r>
             <w:r>
               <w:rPr>
-                <w:rFonts w:ascii="Consolas" w:cs="Consolas" w:eastAsia="Consolas" w:hAnsi="Consolas"/>
+                <w:rFonts w:ascii="Times New Roman" w:cs="Times New Roman" w:eastAsia="Times New Roman" w:hAnsi="Times New Roman"/>
                 <w:color w:val="df5320"/>
                 <w:sz w:val="24"/>
                 <w:szCs w:val="24"/>
@@ -3055,7 +3055,7 @@
             </w:r>
             <w:r>
               <w:rPr>
-                <w:rFonts w:ascii="Consolas" w:cs="Consolas" w:eastAsia="Consolas" w:hAnsi="Consolas"/>
+                <w:rFonts w:ascii="Times New Roman" w:cs="Times New Roman" w:eastAsia="Times New Roman" w:hAnsi="Times New Roman"/>
                 <w:color w:val="a8a19f"/>
                 <w:sz w:val="24"/>
                 <w:szCs w:val="24"/>
@@ -3066,7 +3066,7 @@
             </w:r>
             <w:r>
               <w:rPr>
-                <w:rFonts w:ascii="Consolas" w:cs="Consolas" w:eastAsia="Consolas" w:hAnsi="Consolas"/>
+                <w:rFonts w:ascii="Times New Roman" w:cs="Times New Roman" w:eastAsia="Times New Roman" w:hAnsi="Times New Roman"/>
                 <w:color w:val="df5320"/>
                 <w:sz w:val="24"/>
                 <w:szCs w:val="24"/>
@@ -3077,7 +3077,7 @@
             </w:r>
             <w:r>
               <w:rPr>
-                <w:rFonts w:ascii="Consolas" w:cs="Consolas" w:eastAsia="Consolas" w:hAnsi="Consolas"/>
+                <w:rFonts w:ascii="Times New Roman" w:cs="Times New Roman" w:eastAsia="Times New Roman" w:hAnsi="Times New Roman"/>
                 <w:color w:val="a8a19f"/>
                 <w:sz w:val="24"/>
                 <w:szCs w:val="24"/>
@@ -3088,7 +3088,7 @@
             </w:r>
             <w:r>
               <w:rPr>
-                <w:rFonts w:ascii="Consolas" w:cs="Consolas" w:eastAsia="Consolas" w:hAnsi="Consolas"/>
+                <w:rFonts w:ascii="Times New Roman" w:cs="Times New Roman" w:eastAsia="Times New Roman" w:hAnsi="Times New Roman"/>
                 <w:color w:val="df5320"/>
                 <w:sz w:val="24"/>
                 <w:szCs w:val="24"/>
@@ -3099,7 +3099,7 @@
             </w:r>
             <w:r>
               <w:rPr>
-                <w:rFonts w:ascii="Consolas" w:cs="Consolas" w:eastAsia="Consolas" w:hAnsi="Consolas"/>
+                <w:rFonts w:ascii="Times New Roman" w:cs="Times New Roman" w:eastAsia="Times New Roman" w:hAnsi="Times New Roman"/>
                 <w:color w:val="a8a19f"/>
                 <w:sz w:val="24"/>
                 <w:szCs w:val="24"/>
@@ -3112,7 +3112,7 @@
             </w:r>
             <w:r>
               <w:rPr>
-                <w:rFonts w:ascii="Consolas" w:cs="Consolas" w:eastAsia="Consolas" w:hAnsi="Consolas"/>
+                <w:rFonts w:ascii="Times New Roman" w:cs="Times New Roman" w:eastAsia="Times New Roman" w:hAnsi="Times New Roman"/>
                 <w:color w:val="6666ea"/>
                 <w:sz w:val="24"/>
                 <w:szCs w:val="24"/>
@@ -3123,7 +3123,7 @@
             </w:r>
             <w:r>
               <w:rPr>
-                <w:rFonts w:ascii="Consolas" w:cs="Consolas" w:eastAsia="Consolas" w:hAnsi="Consolas"/>
+                <w:rFonts w:ascii="Times New Roman" w:cs="Times New Roman" w:eastAsia="Times New Roman" w:hAnsi="Times New Roman"/>
                 <w:color w:val="a8a19f"/>
                 <w:sz w:val="24"/>
                 <w:szCs w:val="24"/>
@@ -3134,7 +3134,7 @@
             </w:r>
             <w:r>
               <w:rPr>
-                <w:rFonts w:ascii="Consolas" w:cs="Consolas" w:eastAsia="Consolas" w:hAnsi="Consolas"/>
+                <w:rFonts w:ascii="Times New Roman" w:cs="Times New Roman" w:eastAsia="Times New Roman" w:hAnsi="Times New Roman"/>
                 <w:color w:val="df5320"/>
                 <w:sz w:val="24"/>
                 <w:szCs w:val="24"/>
@@ -3145,7 +3145,7 @@
             </w:r>
             <w:r>
               <w:rPr>
-                <w:rFonts w:ascii="Consolas" w:cs="Consolas" w:eastAsia="Consolas" w:hAnsi="Consolas"/>
+                <w:rFonts w:ascii="Times New Roman" w:cs="Times New Roman" w:eastAsia="Times New Roman" w:hAnsi="Times New Roman"/>
                 <w:color w:val="a8a19f"/>
                 <w:sz w:val="24"/>
                 <w:szCs w:val="24"/>
@@ -3156,7 +3156,7 @@
             </w:r>
             <w:r>
               <w:rPr>
-                <w:rFonts w:ascii="Consolas" w:cs="Consolas" w:eastAsia="Consolas" w:hAnsi="Consolas"/>
+                <w:rFonts w:ascii="Times New Roman" w:cs="Times New Roman" w:eastAsia="Times New Roman" w:hAnsi="Times New Roman"/>
                 <w:color w:val="df5320"/>
                 <w:sz w:val="24"/>
                 <w:szCs w:val="24"/>
@@ -3167,7 +3167,7 @@
             </w:r>
             <w:r>
               <w:rPr>
-                <w:rFonts w:ascii="Consolas" w:cs="Consolas" w:eastAsia="Consolas" w:hAnsi="Consolas"/>
+                <w:rFonts w:ascii="Times New Roman" w:cs="Times New Roman" w:eastAsia="Times New Roman" w:hAnsi="Times New Roman"/>
                 <w:color w:val="a8a19f"/>
                 <w:sz w:val="24"/>
                 <w:szCs w:val="24"/>
@@ -3178,7 +3178,7 @@
             </w:r>
             <w:r>
               <w:rPr>
-                <w:rFonts w:ascii="Consolas" w:cs="Consolas" w:eastAsia="Consolas" w:hAnsi="Consolas"/>
+                <w:rFonts w:ascii="Times New Roman" w:cs="Times New Roman" w:eastAsia="Times New Roman" w:hAnsi="Times New Roman"/>
                 <w:color w:val="df5320"/>
                 <w:sz w:val="24"/>
                 <w:szCs w:val="24"/>
@@ -3189,7 +3189,7 @@
             </w:r>
             <w:r>
               <w:rPr>
-                <w:rFonts w:ascii="Consolas" w:cs="Consolas" w:eastAsia="Consolas" w:hAnsi="Consolas"/>
+                <w:rFonts w:ascii="Times New Roman" w:cs="Times New Roman" w:eastAsia="Times New Roman" w:hAnsi="Times New Roman"/>
                 <w:color w:val="a8a19f"/>
                 <w:sz w:val="24"/>
                 <w:szCs w:val="24"/>
@@ -3200,7 +3200,7 @@
             </w:r>
             <w:r>
               <w:rPr>
-                <w:rFonts w:ascii="Consolas" w:cs="Consolas" w:eastAsia="Consolas" w:hAnsi="Consolas"/>
+                <w:rFonts w:ascii="Times New Roman" w:cs="Times New Roman" w:eastAsia="Times New Roman" w:hAnsi="Times New Roman"/>
                 <w:color w:val="df5320"/>
                 <w:sz w:val="24"/>
                 <w:szCs w:val="24"/>
@@ -3211,7 +3211,7 @@
             </w:r>
             <w:r>
               <w:rPr>
-                <w:rFonts w:ascii="Consolas" w:cs="Consolas" w:eastAsia="Consolas" w:hAnsi="Consolas"/>
+                <w:rFonts w:ascii="Times New Roman" w:cs="Times New Roman" w:eastAsia="Times New Roman" w:hAnsi="Times New Roman"/>
                 <w:color w:val="a8a19f"/>
                 <w:sz w:val="24"/>
                 <w:szCs w:val="24"/>
@@ -3225,7 +3225,7 @@
             </w:r>
             <w:r>
               <w:rPr>
-                <w:rFonts w:ascii="Consolas" w:cs="Consolas" w:eastAsia="Consolas" w:hAnsi="Consolas"/>
+                <w:rFonts w:ascii="Times New Roman" w:cs="Times New Roman" w:eastAsia="Times New Roman" w:hAnsi="Times New Roman"/>
                 <w:color w:val="df5320"/>
                 <w:sz w:val="24"/>
                 <w:szCs w:val="24"/>
@@ -3236,7 +3236,7 @@
             </w:r>
             <w:r>
               <w:rPr>
-                <w:rFonts w:ascii="Consolas" w:cs="Consolas" w:eastAsia="Consolas" w:hAnsi="Consolas"/>
+                <w:rFonts w:ascii="Times New Roman" w:cs="Times New Roman" w:eastAsia="Times New Roman" w:hAnsi="Times New Roman"/>
                 <w:color w:val="a8a19f"/>
                 <w:sz w:val="24"/>
                 <w:szCs w:val="24"/>
@@ -3247,7 +3247,7 @@
             </w:r>
             <w:r>
               <w:rPr>
-                <w:rFonts w:ascii="Consolas" w:cs="Consolas" w:eastAsia="Consolas" w:hAnsi="Consolas"/>
+                <w:rFonts w:ascii="Times New Roman" w:cs="Times New Roman" w:eastAsia="Times New Roman" w:hAnsi="Times New Roman"/>
                 <w:color w:val="df5320"/>
                 <w:sz w:val="24"/>
                 <w:szCs w:val="24"/>
@@ -3258,7 +3258,7 @@
             </w:r>
             <w:r>
               <w:rPr>
-                <w:rFonts w:ascii="Consolas" w:cs="Consolas" w:eastAsia="Consolas" w:hAnsi="Consolas"/>
+                <w:rFonts w:ascii="Times New Roman" w:cs="Times New Roman" w:eastAsia="Times New Roman" w:hAnsi="Times New Roman"/>
                 <w:color w:val="a8a19f"/>
                 <w:sz w:val="24"/>
                 <w:szCs w:val="24"/>
@@ -3365,7 +3365,7 @@
             </w:pPr>
             <w:r>
               <w:rPr>
-                <w:rFonts w:ascii="Consolas" w:cs="Consolas" w:eastAsia="Consolas" w:hAnsi="Consolas"/>
+                <w:rFonts w:ascii="Times New Roman" w:cs="Times New Roman" w:eastAsia="Times New Roman" w:hAnsi="Times New Roman"/>
                 <w:color w:val="a8a19f"/>
                 <w:sz w:val="24"/>
                 <w:szCs w:val="24"/>
@@ -3376,7 +3376,7 @@
             </w:r>
             <w:r>
               <w:rPr>
-                <w:rFonts w:ascii="Consolas" w:cs="Consolas" w:eastAsia="Consolas" w:hAnsi="Consolas"/>
+                <w:rFonts w:ascii="Times New Roman" w:cs="Times New Roman" w:eastAsia="Times New Roman" w:hAnsi="Times New Roman"/>
                 <w:color w:val="df5320"/>
                 <w:sz w:val="24"/>
                 <w:szCs w:val="24"/>
@@ -3387,7 +3387,7 @@
             </w:r>
             <w:r>
               <w:rPr>
-                <w:rFonts w:ascii="Consolas" w:cs="Consolas" w:eastAsia="Consolas" w:hAnsi="Consolas"/>
+                <w:rFonts w:ascii="Times New Roman" w:cs="Times New Roman" w:eastAsia="Times New Roman" w:hAnsi="Times New Roman"/>
                 <w:color w:val="a8a19f"/>
                 <w:sz w:val="24"/>
                 <w:szCs w:val="24"/>
@@ -3402,7 +3402,7 @@
             </w:r>
             <w:r>
               <w:rPr>
-                <w:rFonts w:ascii="Consolas" w:cs="Consolas" w:eastAsia="Consolas" w:hAnsi="Consolas"/>
+                <w:rFonts w:ascii="Times New Roman" w:cs="Times New Roman" w:eastAsia="Times New Roman" w:hAnsi="Times New Roman"/>
                 <w:color w:val="df5320"/>
                 <w:sz w:val="24"/>
                 <w:szCs w:val="24"/>
@@ -3413,7 +3413,7 @@
             </w:r>
             <w:r>
               <w:rPr>
-                <w:rFonts w:ascii="Consolas" w:cs="Consolas" w:eastAsia="Consolas" w:hAnsi="Consolas"/>
+                <w:rFonts w:ascii="Times New Roman" w:cs="Times New Roman" w:eastAsia="Times New Roman" w:hAnsi="Times New Roman"/>
                 <w:color w:val="a8a19f"/>
                 <w:sz w:val="24"/>
                 <w:szCs w:val="24"/>
@@ -3426,7 +3426,7 @@
             </w:r>
             <w:r>
               <w:rPr>
-                <w:rFonts w:ascii="Consolas" w:cs="Consolas" w:eastAsia="Consolas" w:hAnsi="Consolas"/>
+                <w:rFonts w:ascii="Times New Roman" w:cs="Times New Roman" w:eastAsia="Times New Roman" w:hAnsi="Times New Roman"/>
                 <w:color w:val="df5320"/>
                 <w:sz w:val="24"/>
                 <w:szCs w:val="24"/>
@@ -3437,7 +3437,7 @@
             </w:r>
             <w:r>
               <w:rPr>
-                <w:rFonts w:ascii="Consolas" w:cs="Consolas" w:eastAsia="Consolas" w:hAnsi="Consolas"/>
+                <w:rFonts w:ascii="Times New Roman" w:cs="Times New Roman" w:eastAsia="Times New Roman" w:hAnsi="Times New Roman"/>
                 <w:color w:val="a8a19f"/>
                 <w:sz w:val="24"/>
                 <w:szCs w:val="24"/>
@@ -3450,7 +3450,7 @@
             </w:r>
             <w:r>
               <w:rPr>
-                <w:rFonts w:ascii="Consolas" w:cs="Consolas" w:eastAsia="Consolas" w:hAnsi="Consolas"/>
+                <w:rFonts w:ascii="Times New Roman" w:cs="Times New Roman" w:eastAsia="Times New Roman" w:hAnsi="Times New Roman"/>
                 <w:color w:val="df5320"/>
                 <w:sz w:val="24"/>
                 <w:szCs w:val="24"/>
@@ -3461,7 +3461,7 @@
             </w:r>
             <w:r>
               <w:rPr>
-                <w:rFonts w:ascii="Consolas" w:cs="Consolas" w:eastAsia="Consolas" w:hAnsi="Consolas"/>
+                <w:rFonts w:ascii="Times New Roman" w:cs="Times New Roman" w:eastAsia="Times New Roman" w:hAnsi="Times New Roman"/>
                 <w:color w:val="a8a19f"/>
                 <w:sz w:val="24"/>
                 <w:szCs w:val="24"/>
@@ -3544,7 +3544,7 @@
       </w:r>
       <w:r>
         <w:rPr>
-          <w:rFonts w:ascii="Roboto Mono" w:cs="Roboto Mono" w:eastAsia="Roboto Mono" w:hAnsi="Roboto Mono"/>
+          <w:rFonts w:ascii="Times New Roman" w:cs="Times New Roman" w:eastAsia="Times New Roman" w:hAnsi="Times New Roman"/>
           <w:sz w:val="24"/>
           <w:szCs w:val="24"/>
           <w:rtl w:val="0"/>
@@ -3636,7 +3636,7 @@
             </w:pPr>
             <w:r>
               <w:rPr>
-                <w:rFonts w:ascii="Consolas" w:cs="Consolas" w:eastAsia="Consolas" w:hAnsi="Consolas"/>
+                <w:rFonts w:ascii="Times New Roman" w:cs="Times New Roman" w:eastAsia="Times New Roman" w:hAnsi="Times New Roman"/>
                 <w:color w:val="6666ea"/>
                 <w:sz w:val="24"/>
                 <w:szCs w:val="24"/>
@@ -3647,7 +3647,7 @@
             </w:r>
             <w:r>
               <w:rPr>
-                <w:rFonts w:ascii="Consolas" w:cs="Consolas" w:eastAsia="Consolas" w:hAnsi="Consolas"/>
+                <w:rFonts w:ascii="Times New Roman" w:cs="Times New Roman" w:eastAsia="Times New Roman" w:hAnsi="Times New Roman"/>
                 <w:color w:val="a8a19f"/>
                 <w:sz w:val="24"/>
                 <w:szCs w:val="24"/>
@@ -3658,7 +3658,7 @@
             </w:r>
             <w:r>
               <w:rPr>
-                <w:rFonts w:ascii="Consolas" w:cs="Consolas" w:eastAsia="Consolas" w:hAnsi="Consolas"/>
+                <w:rFonts w:ascii="Times New Roman" w:cs="Times New Roman" w:eastAsia="Times New Roman" w:hAnsi="Times New Roman"/>
                 <w:color w:val="df5320"/>
                 <w:sz w:val="24"/>
                 <w:szCs w:val="24"/>
@@ -3669,7 +3669,7 @@
             </w:r>
             <w:r>
               <w:rPr>
-                <w:rFonts w:ascii="Consolas" w:cs="Consolas" w:eastAsia="Consolas" w:hAnsi="Consolas"/>
+                <w:rFonts w:ascii="Times New Roman" w:cs="Times New Roman" w:eastAsia="Times New Roman" w:hAnsi="Times New Roman"/>
                 <w:color w:val="a8a19f"/>
                 <w:sz w:val="24"/>
                 <w:szCs w:val="24"/>
@@ -3680,7 +3680,7 @@
             </w:r>
             <w:r>
               <w:rPr>
-                <w:rFonts w:ascii="Consolas" w:cs="Consolas" w:eastAsia="Consolas" w:hAnsi="Consolas"/>
+                <w:rFonts w:ascii="Times New Roman" w:cs="Times New Roman" w:eastAsia="Times New Roman" w:hAnsi="Times New Roman"/>
                 <w:color w:val="df5320"/>
                 <w:sz w:val="24"/>
                 <w:szCs w:val="24"/>
@@ -3691,7 +3691,7 @@
             </w:r>
             <w:r>
               <w:rPr>
-                <w:rFonts w:ascii="Consolas" w:cs="Consolas" w:eastAsia="Consolas" w:hAnsi="Consolas"/>
+                <w:rFonts w:ascii="Times New Roman" w:cs="Times New Roman" w:eastAsia="Times New Roman" w:hAnsi="Times New Roman"/>
                 <w:color w:val="a8a19f"/>
                 <w:sz w:val="24"/>
                 <w:szCs w:val="24"/>
@@ -3702,7 +3702,7 @@
             </w:r>
             <w:r>
               <w:rPr>
-                <w:rFonts w:ascii="Consolas" w:cs="Consolas" w:eastAsia="Consolas" w:hAnsi="Consolas"/>
+                <w:rFonts w:ascii="Times New Roman" w:cs="Times New Roman" w:eastAsia="Times New Roman" w:hAnsi="Times New Roman"/>
                 <w:color w:val="df5320"/>
                 <w:sz w:val="24"/>
                 <w:szCs w:val="24"/>
@@ -3713,7 +3713,7 @@
             </w:r>
             <w:r>
               <w:rPr>
-                <w:rFonts w:ascii="Consolas" w:cs="Consolas" w:eastAsia="Consolas" w:hAnsi="Consolas"/>
+                <w:rFonts w:ascii="Times New Roman" w:cs="Times New Roman" w:eastAsia="Times New Roman" w:hAnsi="Times New Roman"/>
                 <w:color w:val="a8a19f"/>
                 <w:sz w:val="24"/>
                 <w:szCs w:val="24"/>
@@ -3724,7 +3724,7 @@
             </w:r>
             <w:r>
               <w:rPr>
-                <w:rFonts w:ascii="Consolas" w:cs="Consolas" w:eastAsia="Consolas" w:hAnsi="Consolas"/>
+                <w:rFonts w:ascii="Times New Roman" w:cs="Times New Roman" w:eastAsia="Times New Roman" w:hAnsi="Times New Roman"/>
                 <w:color w:val="df5320"/>
                 <w:sz w:val="24"/>
                 <w:szCs w:val="24"/>
@@ -3735,7 +3735,7 @@
             </w:r>
             <w:r>
               <w:rPr>
-                <w:rFonts w:ascii="Consolas" w:cs="Consolas" w:eastAsia="Consolas" w:hAnsi="Consolas"/>
+                <w:rFonts w:ascii="Times New Roman" w:cs="Times New Roman" w:eastAsia="Times New Roman" w:hAnsi="Times New Roman"/>
                 <w:color w:val="a8a19f"/>
                 <w:sz w:val="24"/>
                 <w:szCs w:val="24"/>
@@ -3746,7 +3746,7 @@
             </w:r>
             <w:r>
               <w:rPr>
-                <w:rFonts w:ascii="Consolas" w:cs="Consolas" w:eastAsia="Consolas" w:hAnsi="Consolas"/>
+                <w:rFonts w:ascii="Times New Roman" w:cs="Times New Roman" w:eastAsia="Times New Roman" w:hAnsi="Times New Roman"/>
                 <w:color w:val="df5320"/>
                 <w:sz w:val="24"/>
                 <w:szCs w:val="24"/>
@@ -3757,7 +3757,7 @@
             </w:r>
             <w:r>
               <w:rPr>
-                <w:rFonts w:ascii="Consolas" w:cs="Consolas" w:eastAsia="Consolas" w:hAnsi="Consolas"/>
+                <w:rFonts w:ascii="Times New Roman" w:cs="Times New Roman" w:eastAsia="Times New Roman" w:hAnsi="Times New Roman"/>
                 <w:color w:val="a8a19f"/>
                 <w:sz w:val="24"/>
                 <w:szCs w:val="24"/>
@@ -3768,7 +3768,7 @@
             </w:r>
             <w:r>
               <w:rPr>
-                <w:rFonts w:ascii="Consolas" w:cs="Consolas" w:eastAsia="Consolas" w:hAnsi="Consolas"/>
+                <w:rFonts w:ascii="Times New Roman" w:cs="Times New Roman" w:eastAsia="Times New Roman" w:hAnsi="Times New Roman"/>
                 <w:color w:val="9c9491"/>
                 <w:sz w:val="24"/>
                 <w:szCs w:val="24"/>
@@ -3779,19 +3779,19 @@
             </w:r>
             <w:r>
               <w:rPr>
-                <w:rFonts w:ascii="Consolas" w:cs="Consolas" w:eastAsia="Consolas" w:hAnsi="Consolas"/>
-                <w:color w:val="a8a19f"/>
-                <w:sz w:val="24"/>
-                <w:szCs w:val="24"/>
-                <w:shd w:fill="1b1918" w:val="clear"/>
-                <w:rtl w:val="0"/>
-              </w:rPr>
-              <w:br w:type="textWrapping"/>
-              <w:br w:type="textWrapping"/>
-            </w:r>
-            <w:r>
-              <w:rPr>
-                <w:rFonts w:ascii="Consolas" w:cs="Consolas" w:eastAsia="Consolas" w:hAnsi="Consolas"/>
+                <w:rFonts w:ascii="Times New Roman" w:cs="Times New Roman" w:eastAsia="Times New Roman" w:hAnsi="Times New Roman"/>
+                <w:color w:val="a8a19f"/>
+                <w:sz w:val="24"/>
+                <w:szCs w:val="24"/>
+                <w:shd w:fill="1b1918" w:val="clear"/>
+                <w:rtl w:val="0"/>
+              </w:rPr>
+              <w:br w:type="textWrapping"/>
+              <w:br w:type="textWrapping"/>
+            </w:r>
+            <w:r>
+              <w:rPr>
+                <w:rFonts w:ascii="Times New Roman" w:cs="Times New Roman" w:eastAsia="Times New Roman" w:hAnsi="Times New Roman"/>
                 <w:color w:val="9c9491"/>
                 <w:sz w:val="24"/>
                 <w:szCs w:val="24"/>
@@ -3802,18 +3802,18 @@
             </w:r>
             <w:r>
               <w:rPr>
-                <w:rFonts w:ascii="Consolas" w:cs="Consolas" w:eastAsia="Consolas" w:hAnsi="Consolas"/>
-                <w:color w:val="a8a19f"/>
-                <w:sz w:val="24"/>
-                <w:szCs w:val="24"/>
-                <w:shd w:fill="1b1918" w:val="clear"/>
-                <w:rtl w:val="0"/>
-              </w:rPr>
-              <w:br w:type="textWrapping"/>
-            </w:r>
-            <w:r>
-              <w:rPr>
-                <w:rFonts w:ascii="Consolas" w:cs="Consolas" w:eastAsia="Consolas" w:hAnsi="Consolas"/>
+                <w:rFonts w:ascii="Times New Roman" w:cs="Times New Roman" w:eastAsia="Times New Roman" w:hAnsi="Times New Roman"/>
+                <w:color w:val="a8a19f"/>
+                <w:sz w:val="24"/>
+                <w:szCs w:val="24"/>
+                <w:shd w:fill="1b1918" w:val="clear"/>
+                <w:rtl w:val="0"/>
+              </w:rPr>
+              <w:br w:type="textWrapping"/>
+            </w:r>
+            <w:r>
+              <w:rPr>
+                <w:rFonts w:ascii="Times New Roman" w:cs="Times New Roman" w:eastAsia="Times New Roman" w:hAnsi="Times New Roman"/>
                 <w:color w:val="6666ea"/>
                 <w:sz w:val="24"/>
                 <w:szCs w:val="24"/>
@@ -3824,7 +3824,7 @@
             </w:r>
             <w:r>
               <w:rPr>
-                <w:rFonts w:ascii="Consolas" w:cs="Consolas" w:eastAsia="Consolas" w:hAnsi="Consolas"/>
+                <w:rFonts w:ascii="Times New Roman" w:cs="Times New Roman" w:eastAsia="Times New Roman" w:hAnsi="Times New Roman"/>
                 <w:color w:val="a8a19f"/>
                 <w:sz w:val="24"/>
                 <w:szCs w:val="24"/>
@@ -3835,7 +3835,7 @@
             </w:r>
             <w:r>
               <w:rPr>
-                <w:rFonts w:ascii="Consolas" w:cs="Consolas" w:eastAsia="Consolas" w:hAnsi="Consolas"/>
+                <w:rFonts w:ascii="Times New Roman" w:cs="Times New Roman" w:eastAsia="Times New Roman" w:hAnsi="Times New Roman"/>
                 <w:color w:val="df5320"/>
                 <w:sz w:val="24"/>
                 <w:szCs w:val="24"/>
@@ -3846,7 +3846,7 @@
             </w:r>
             <w:r>
               <w:rPr>
-                <w:rFonts w:ascii="Consolas" w:cs="Consolas" w:eastAsia="Consolas" w:hAnsi="Consolas"/>
+                <w:rFonts w:ascii="Times New Roman" w:cs="Times New Roman" w:eastAsia="Times New Roman" w:hAnsi="Times New Roman"/>
                 <w:color w:val="a8a19f"/>
                 <w:sz w:val="24"/>
                 <w:szCs w:val="24"/>
@@ -3857,7 +3857,7 @@
             </w:r>
             <w:r>
               <w:rPr>
-                <w:rFonts w:ascii="Consolas" w:cs="Consolas" w:eastAsia="Consolas" w:hAnsi="Consolas"/>
+                <w:rFonts w:ascii="Times New Roman" w:cs="Times New Roman" w:eastAsia="Times New Roman" w:hAnsi="Times New Roman"/>
                 <w:color w:val="df5320"/>
                 <w:sz w:val="24"/>
                 <w:szCs w:val="24"/>
@@ -3868,7 +3868,7 @@
             </w:r>
             <w:r>
               <w:rPr>
-                <w:rFonts w:ascii="Consolas" w:cs="Consolas" w:eastAsia="Consolas" w:hAnsi="Consolas"/>
+                <w:rFonts w:ascii="Times New Roman" w:cs="Times New Roman" w:eastAsia="Times New Roman" w:hAnsi="Times New Roman"/>
                 <w:color w:val="a8a19f"/>
                 <w:sz w:val="24"/>
                 <w:szCs w:val="24"/>
@@ -3879,7 +3879,7 @@
             </w:r>
             <w:r>
               <w:rPr>
-                <w:rFonts w:ascii="Consolas" w:cs="Consolas" w:eastAsia="Consolas" w:hAnsi="Consolas"/>
+                <w:rFonts w:ascii="Times New Roman" w:cs="Times New Roman" w:eastAsia="Times New Roman" w:hAnsi="Times New Roman"/>
                 <w:color w:val="df5320"/>
                 <w:sz w:val="24"/>
                 <w:szCs w:val="24"/>
@@ -3890,7 +3890,7 @@
             </w:r>
             <w:r>
               <w:rPr>
-                <w:rFonts w:ascii="Consolas" w:cs="Consolas" w:eastAsia="Consolas" w:hAnsi="Consolas"/>
+                <w:rFonts w:ascii="Times New Roman" w:cs="Times New Roman" w:eastAsia="Times New Roman" w:hAnsi="Times New Roman"/>
                 <w:color w:val="a8a19f"/>
                 <w:sz w:val="24"/>
                 <w:szCs w:val="24"/>
@@ -3903,7 +3903,7 @@
             </w:r>
             <w:r>
               <w:rPr>
-                <w:rFonts w:ascii="Consolas" w:cs="Consolas" w:eastAsia="Consolas" w:hAnsi="Consolas"/>
+                <w:rFonts w:ascii="Times New Roman" w:cs="Times New Roman" w:eastAsia="Times New Roman" w:hAnsi="Times New Roman"/>
                 <w:color w:val="7b9726"/>
                 <w:sz w:val="24"/>
                 <w:szCs w:val="24"/>
@@ -3914,7 +3914,7 @@
             </w:r>
             <w:r>
               <w:rPr>
-                <w:rFonts w:ascii="Consolas" w:cs="Consolas" w:eastAsia="Consolas" w:hAnsi="Consolas"/>
+                <w:rFonts w:ascii="Times New Roman" w:cs="Times New Roman" w:eastAsia="Times New Roman" w:hAnsi="Times New Roman"/>
                 <w:color w:val="a8a19f"/>
                 <w:sz w:val="24"/>
                 <w:szCs w:val="24"/>
@@ -3929,7 +3929,7 @@
             </w:r>
             <w:r>
               <w:rPr>
-                <w:rFonts w:ascii="Consolas" w:cs="Consolas" w:eastAsia="Consolas" w:hAnsi="Consolas"/>
+                <w:rFonts w:ascii="Times New Roman" w:cs="Times New Roman" w:eastAsia="Times New Roman" w:hAnsi="Times New Roman"/>
                 <w:color w:val="9c9491"/>
                 <w:sz w:val="24"/>
                 <w:szCs w:val="24"/>
@@ -3940,18 +3940,18 @@
             </w:r>
             <w:r>
               <w:rPr>
-                <w:rFonts w:ascii="Consolas" w:cs="Consolas" w:eastAsia="Consolas" w:hAnsi="Consolas"/>
-                <w:color w:val="a8a19f"/>
-                <w:sz w:val="24"/>
-                <w:szCs w:val="24"/>
-                <w:shd w:fill="1b1918" w:val="clear"/>
-                <w:rtl w:val="0"/>
-              </w:rPr>
-              <w:br w:type="textWrapping"/>
-            </w:r>
-            <w:r>
-              <w:rPr>
-                <w:rFonts w:ascii="Consolas" w:cs="Consolas" w:eastAsia="Consolas" w:hAnsi="Consolas"/>
+                <w:rFonts w:ascii="Times New Roman" w:cs="Times New Roman" w:eastAsia="Times New Roman" w:hAnsi="Times New Roman"/>
+                <w:color w:val="a8a19f"/>
+                <w:sz w:val="24"/>
+                <w:szCs w:val="24"/>
+                <w:shd w:fill="1b1918" w:val="clear"/>
+                <w:rtl w:val="0"/>
+              </w:rPr>
+              <w:br w:type="textWrapping"/>
+            </w:r>
+            <w:r>
+              <w:rPr>
+                <w:rFonts w:ascii="Times New Roman" w:cs="Times New Roman" w:eastAsia="Times New Roman" w:hAnsi="Times New Roman"/>
                 <w:color w:val="6666ea"/>
                 <w:sz w:val="24"/>
                 <w:szCs w:val="24"/>
@@ -3962,7 +3962,7 @@
             </w:r>
             <w:r>
               <w:rPr>
-                <w:rFonts w:ascii="Consolas" w:cs="Consolas" w:eastAsia="Consolas" w:hAnsi="Consolas"/>
+                <w:rFonts w:ascii="Times New Roman" w:cs="Times New Roman" w:eastAsia="Times New Roman" w:hAnsi="Times New Roman"/>
                 <w:color w:val="a8a19f"/>
                 <w:sz w:val="24"/>
                 <w:szCs w:val="24"/>
@@ -3973,7 +3973,7 @@
             </w:r>
             <w:r>
               <w:rPr>
-                <w:rFonts w:ascii="Consolas" w:cs="Consolas" w:eastAsia="Consolas" w:hAnsi="Consolas"/>
+                <w:rFonts w:ascii="Times New Roman" w:cs="Times New Roman" w:eastAsia="Times New Roman" w:hAnsi="Times New Roman"/>
                 <w:color w:val="6666ea"/>
                 <w:sz w:val="24"/>
                 <w:szCs w:val="24"/>
@@ -3984,7 +3984,7 @@
             </w:r>
             <w:r>
               <w:rPr>
-                <w:rFonts w:ascii="Consolas" w:cs="Consolas" w:eastAsia="Consolas" w:hAnsi="Consolas"/>
+                <w:rFonts w:ascii="Times New Roman" w:cs="Times New Roman" w:eastAsia="Times New Roman" w:hAnsi="Times New Roman"/>
                 <w:color w:val="a8a19f"/>
                 <w:sz w:val="24"/>
                 <w:szCs w:val="24"/>
@@ -3995,7 +3995,7 @@
             </w:r>
             <w:r>
               <w:rPr>
-                <w:rFonts w:ascii="Consolas" w:cs="Consolas" w:eastAsia="Consolas" w:hAnsi="Consolas"/>
+                <w:rFonts w:ascii="Times New Roman" w:cs="Times New Roman" w:eastAsia="Times New Roman" w:hAnsi="Times New Roman"/>
                 <w:color w:val="df5320"/>
                 <w:sz w:val="24"/>
                 <w:szCs w:val="24"/>
@@ -4006,7 +4006,7 @@
             </w:r>
             <w:r>
               <w:rPr>
-                <w:rFonts w:ascii="Consolas" w:cs="Consolas" w:eastAsia="Consolas" w:hAnsi="Consolas"/>
+                <w:rFonts w:ascii="Times New Roman" w:cs="Times New Roman" w:eastAsia="Times New Roman" w:hAnsi="Times New Roman"/>
                 <w:color w:val="a8a19f"/>
                 <w:sz w:val="24"/>
                 <w:szCs w:val="24"/>
@@ -4026,11 +4026,26 @@
     </w:tbl>
     <w:p>
       <w:pPr>
+        <w:pStyle w:val="Heading2"/>
+        <w:spacing w:line="360" w:lineRule="auto"/>
+        <w:jc w:val="both"/>
         <w:rPr>
           <w:rFonts w:ascii="Times New Roman" w:cs="Times New Roman" w:eastAsia="Times New Roman" w:hAnsi="Times New Roman"/>
-          <w:sz w:val="24"/>
-          <w:szCs w:val="24"/>
+          <w:b w:val="1"/>
+          <w:bCs w:val="1"/>
         </w:rPr>
+      </w:pPr>
+      <w:bookmarkStart w:colFirst="0" w:colLast="0" w:name="_od518v2gi5ir" w:id="1"/>
+      <w:bookmarkEnd w:id="1"/>
+      <w:r>
+        <w:rPr>
+          <w:rtl w:val="0"/>
+        </w:rPr>
+      </w:r>
+    </w:p>
+    <w:p>
+      <w:pPr>
+        <w:rPr/>
       </w:pPr>
       <w:r>
         <w:rPr>
@@ -4049,8 +4064,8 @@
           <w:bCs w:val="1"/>
         </w:rPr>
       </w:pPr>
-      <w:bookmarkStart w:colFirst="0" w:colLast="0" w:name="_9yg3cw8cleic" w:id="1"/>
-      <w:bookmarkEnd w:id="1"/>
+      <w:bookmarkStart w:colFirst="0" w:colLast="0" w:name="_9yg3cw8cleic" w:id="2"/>
+      <w:bookmarkEnd w:id="2"/>
       <w:r>
         <w:rPr>
           <w:rFonts w:ascii="Times New Roman" w:cs="Times New Roman" w:eastAsia="Times New Roman" w:hAnsi="Times New Roman"/>
@@ -4063,10 +4078,15 @@
     </w:p>
     <w:p>
       <w:pPr>
-        <w:rPr/>
+        <w:spacing w:line="360" w:lineRule="auto"/>
+        <w:jc w:val="both"/>
+        <w:rPr>
+          <w:rFonts w:ascii="Times New Roman" w:cs="Times New Roman" w:eastAsia="Times New Roman" w:hAnsi="Times New Roman"/>
+        </w:rPr>
       </w:pPr>
       <w:r>
         <w:rPr>
+          <w:rFonts w:ascii="Times New Roman" w:cs="Times New Roman" w:eastAsia="Times New Roman" w:hAnsi="Times New Roman"/>
           <w:rtl w:val="0"/>
         </w:rPr>
         <w:t xml:space="preserve">The script ran successfully. Visualization is in the README</w:t>
@@ -4079,10 +4099,16 @@
     </w:p>
     <w:p>
       <w:pPr>
-        <w:rPr/>
+        <w:spacing w:line="360" w:lineRule="auto"/>
+        <w:jc w:val="both"/>
+        <w:rPr>
+          <w:rFonts w:ascii="Times New Roman" w:cs="Times New Roman" w:eastAsia="Times New Roman" w:hAnsi="Times New Roman"/>
+        </w:rPr>
       </w:pPr>
       <w:r>
-        <w:rPr/>
+        <w:rPr>
+          <w:rFonts w:ascii="Times New Roman" w:cs="Times New Roman" w:eastAsia="Times New Roman" w:hAnsi="Times New Roman"/>
+        </w:rPr>
         <w:drawing>
           <wp:inline distB="114300" distT="114300" distL="114300" distR="114300">
             <wp:extent cx="5705475" cy="2114550"/>
@@ -4133,8 +4159,8 @@
           <w:bCs w:val="1"/>
         </w:rPr>
       </w:pPr>
-      <w:bookmarkStart w:colFirst="0" w:colLast="0" w:name="_vnsnvgyqqzie" w:id="2"/>
-      <w:bookmarkEnd w:id="2"/>
+      <w:bookmarkStart w:colFirst="0" w:colLast="0" w:name="_vnsnvgyqqzie" w:id="3"/>
+      <w:bookmarkEnd w:id="3"/>
       <w:r>
         <w:rPr>
           <w:rtl w:val="0"/>
@@ -4143,7 +4169,11 @@
     </w:p>
     <w:p>
       <w:pPr>
-        <w:rPr/>
+        <w:spacing w:line="360" w:lineRule="auto"/>
+        <w:jc w:val="both"/>
+        <w:rPr>
+          <w:rFonts w:ascii="Times New Roman" w:cs="Times New Roman" w:eastAsia="Times New Roman" w:hAnsi="Times New Roman"/>
+        </w:rPr>
       </w:pPr>
       <w:r>
         <w:rPr>
@@ -4153,7 +4183,11 @@
     </w:p>
     <w:p>
       <w:pPr>
-        <w:rPr/>
+        <w:spacing w:line="360" w:lineRule="auto"/>
+        <w:jc w:val="both"/>
+        <w:rPr>
+          <w:rFonts w:ascii="Times New Roman" w:cs="Times New Roman" w:eastAsia="Times New Roman" w:hAnsi="Times New Roman"/>
+        </w:rPr>
       </w:pPr>
       <w:r>
         <w:rPr>
@@ -4163,7 +4197,11 @@
     </w:p>
     <w:p>
       <w:pPr>
-        <w:rPr/>
+        <w:spacing w:line="360" w:lineRule="auto"/>
+        <w:jc w:val="both"/>
+        <w:rPr>
+          <w:rFonts w:ascii="Times New Roman" w:cs="Times New Roman" w:eastAsia="Times New Roman" w:hAnsi="Times New Roman"/>
+        </w:rPr>
       </w:pPr>
       <w:r>
         <w:rPr>
@@ -4173,7 +4211,11 @@
     </w:p>
     <w:p>
       <w:pPr>
-        <w:rPr/>
+        <w:spacing w:line="360" w:lineRule="auto"/>
+        <w:jc w:val="both"/>
+        <w:rPr>
+          <w:rFonts w:ascii="Times New Roman" w:cs="Times New Roman" w:eastAsia="Times New Roman" w:hAnsi="Times New Roman"/>
+        </w:rPr>
       </w:pPr>
       <w:r>
         <w:rPr>
@@ -4183,7 +4225,11 @@
     </w:p>
     <w:p>
       <w:pPr>
-        <w:rPr/>
+        <w:spacing w:line="360" w:lineRule="auto"/>
+        <w:jc w:val="both"/>
+        <w:rPr>
+          <w:rFonts w:ascii="Times New Roman" w:cs="Times New Roman" w:eastAsia="Times New Roman" w:hAnsi="Times New Roman"/>
+        </w:rPr>
       </w:pPr>
       <w:r>
         <w:rPr>
@@ -4202,8 +4248,8 @@
           <w:bCs w:val="1"/>
         </w:rPr>
       </w:pPr>
-      <w:bookmarkStart w:colFirst="0" w:colLast="0" w:name="_pyakvpeedzsk" w:id="3"/>
-      <w:bookmarkEnd w:id="3"/>
+      <w:bookmarkStart w:colFirst="0" w:colLast="0" w:name="_pyakvpeedzsk" w:id="4"/>
+      <w:bookmarkEnd w:id="4"/>
       <w:r>
         <w:rPr>
           <w:rFonts w:ascii="Times New Roman" w:cs="Times New Roman" w:eastAsia="Times New Roman" w:hAnsi="Times New Roman"/>
@@ -4606,7 +4652,7 @@
             </w:r>
             <w:r>
               <w:rPr>
-                <w:rFonts w:ascii="Roboto Mono" w:cs="Roboto Mono" w:eastAsia="Roboto Mono" w:hAnsi="Roboto Mono"/>
+                <w:rFonts w:ascii="Times New Roman" w:cs="Times New Roman" w:eastAsia="Times New Roman" w:hAnsi="Times New Roman"/>
                 <w:sz w:val="24"/>
                 <w:szCs w:val="24"/>
                 <w:rtl w:val="0"/>
@@ -5952,7 +5998,7 @@
             </w:r>
             <w:r>
               <w:rPr>
-                <w:rFonts w:ascii="Roboto Mono" w:cs="Roboto Mono" w:eastAsia="Roboto Mono" w:hAnsi="Roboto Mono"/>
+                <w:rFonts w:ascii="Times New Roman" w:cs="Times New Roman" w:eastAsia="Times New Roman" w:hAnsi="Times New Roman"/>
                 <w:sz w:val="24"/>
                 <w:szCs w:val="24"/>
                 <w:rtl w:val="0"/>
@@ -6092,7 +6138,7 @@
             </w:r>
             <w:r>
               <w:rPr>
-                <w:rFonts w:ascii="Roboto Mono" w:cs="Roboto Mono" w:eastAsia="Roboto Mono" w:hAnsi="Roboto Mono"/>
+                <w:rFonts w:ascii="Times New Roman" w:cs="Times New Roman" w:eastAsia="Times New Roman" w:hAnsi="Times New Roman"/>
                 <w:sz w:val="24"/>
                 <w:szCs w:val="24"/>
                 <w:rtl w:val="0"/>
@@ -6110,7 +6156,7 @@
             </w:r>
             <w:r>
               <w:rPr>
-                <w:rFonts w:ascii="Roboto Mono" w:cs="Roboto Mono" w:eastAsia="Roboto Mono" w:hAnsi="Roboto Mono"/>
+                <w:rFonts w:ascii="Times New Roman" w:cs="Times New Roman" w:eastAsia="Times New Roman" w:hAnsi="Times New Roman"/>
                 <w:sz w:val="24"/>
                 <w:szCs w:val="24"/>
                 <w:rtl w:val="0"/>
@@ -6128,7 +6174,7 @@
             </w:r>
             <w:r>
               <w:rPr>
-                <w:rFonts w:ascii="Roboto Mono" w:cs="Roboto Mono" w:eastAsia="Roboto Mono" w:hAnsi="Roboto Mono"/>
+                <w:rFonts w:ascii="Times New Roman" w:cs="Times New Roman" w:eastAsia="Times New Roman" w:hAnsi="Times New Roman"/>
                 <w:sz w:val="24"/>
                 <w:szCs w:val="24"/>
                 <w:rtl w:val="0"/>
@@ -6146,7 +6192,7 @@
             </w:r>
             <w:r>
               <w:rPr>
-                <w:rFonts w:ascii="Roboto Mono" w:cs="Roboto Mono" w:eastAsia="Roboto Mono" w:hAnsi="Roboto Mono"/>
+                <w:rFonts w:ascii="Times New Roman" w:cs="Times New Roman" w:eastAsia="Times New Roman" w:hAnsi="Times New Roman"/>
                 <w:sz w:val="24"/>
                 <w:szCs w:val="24"/>
                 <w:rtl w:val="0"/>
@@ -6164,7 +6210,7 @@
             </w:r>
             <w:r>
               <w:rPr>
-                <w:rFonts w:ascii="Roboto Mono" w:cs="Roboto Mono" w:eastAsia="Roboto Mono" w:hAnsi="Roboto Mono"/>
+                <w:rFonts w:ascii="Times New Roman" w:cs="Times New Roman" w:eastAsia="Times New Roman" w:hAnsi="Times New Roman"/>
                 <w:sz w:val="24"/>
                 <w:szCs w:val="24"/>
                 <w:rtl w:val="0"/>
@@ -6238,11 +6284,22 @@
       <w:r>
         <w:rPr>
           <w:rFonts w:ascii="Times New Roman" w:cs="Times New Roman" w:eastAsia="Times New Roman" w:hAnsi="Times New Roman"/>
+          <w:b w:val="1"/>
+          <w:bCs w:val="1"/>
           <w:sz w:val="24"/>
           <w:szCs w:val="24"/>
           <w:rtl w:val="0"/>
         </w:rPr>
-        <w:t xml:space="preserve">Limitation: a counterfeiter can copy a valid QR code onto a fake pack. The blockchain secures the record, not the physical pack. Scan-anomaly detection reduces the risk, and unit-level serialization is future work.</w:t>
+        <w:t xml:space="preserve">Limitation:</w:t>
+      </w:r>
+      <w:r>
+        <w:rPr>
+          <w:rFonts w:ascii="Times New Roman" w:cs="Times New Roman" w:eastAsia="Times New Roman" w:hAnsi="Times New Roman"/>
+          <w:sz w:val="24"/>
+          <w:szCs w:val="24"/>
+          <w:rtl w:val="0"/>
+        </w:rPr>
+        <w:t xml:space="preserve"> a counterfeiter can copy a valid QR code onto a fake pack. The blockchain secures the record, not the physical pack. Scan-anomaly detection reduces the risk, and unit-level serialization is future work.</w:t>
       </w:r>
     </w:p>
     <w:p>
@@ -6277,7 +6334,7 @@
       </w:r>
       <w:r>
         <w:rPr>
-          <w:rFonts w:ascii="Roboto Mono" w:cs="Roboto Mono" w:eastAsia="Roboto Mono" w:hAnsi="Roboto Mono"/>
+          <w:rFonts w:ascii="Times New Roman" w:cs="Times New Roman" w:eastAsia="Times New Roman" w:hAnsi="Times New Roman"/>
           <w:sz w:val="24"/>
           <w:szCs w:val="24"/>
           <w:rtl w:val="0"/>
@@ -6305,8 +6362,8 @@
           <w:bCs w:val="1"/>
         </w:rPr>
       </w:pPr>
-      <w:bookmarkStart w:colFirst="0" w:colLast="0" w:name="_w644w0ln3vn6" w:id="4"/>
-      <w:bookmarkEnd w:id="4"/>
+      <w:bookmarkStart w:colFirst="0" w:colLast="0" w:name="_w644w0ln3vn6" w:id="5"/>
+      <w:bookmarkEnd w:id="5"/>
       <w:r>
         <w:rPr>
           <w:rFonts w:ascii="Times New Roman" w:cs="Times New Roman" w:eastAsia="Times New Roman" w:hAnsi="Times New Roman"/>

</xml_diff>